<commit_message>
update the EDA visualization
</commit_message>
<xml_diff>
--- a/Note.docx
+++ b/Note.docx
@@ -91,17 +91,7 @@
           <w:szCs w:val="20"/>
           <w14:ligatures w14:val="none"/>
         </w:rPr>
-        <w:t>G</w:t>
-      </w:r>
-      <w:r>
-        <w:rPr>
-          <w:rFonts w:ascii="Courier New" w:eastAsia="Times New Roman" w:hAnsi="Courier New" w:cs="Courier New"/>
-          <w:kern w:val="0"/>
-          <w:sz w:val="20"/>
-          <w:szCs w:val="20"/>
-          <w14:ligatures w14:val="none"/>
-        </w:rPr>
-        <w:t>ender</w:t>
+        <w:t>Gender</w:t>
       </w:r>
       <w:r>
         <w:rPr>
@@ -129,8 +119,6 @@
           <w14:ligatures w14:val="none"/>
         </w:rPr>
       </w:pPr>
-      <w:proofErr w:type="spellStart"/>
-      <w:proofErr w:type="gramStart"/>
       <w:r>
         <w:rPr>
           <w:rFonts w:ascii="Courier New" w:eastAsia="Times New Roman" w:hAnsi="Courier New" w:cs="Courier New"/>
@@ -141,7 +129,6 @@
         </w:rPr>
         <w:t>SeniorCitizen</w:t>
       </w:r>
-      <w:proofErr w:type="spellEnd"/>
       <w:r>
         <w:rPr>
           <w:rFonts w:ascii="Times New Roman" w:eastAsia="Times New Roman" w:hAnsi="Times New Roman" w:cs="Times New Roman"/>
@@ -156,16 +143,7 @@
           <w:kern w:val="0"/>
           <w14:ligatures w14:val="none"/>
         </w:rPr>
-        <w:t>:</w:t>
-      </w:r>
-      <w:proofErr w:type="gramEnd"/>
-      <w:r>
-        <w:rPr>
-          <w:rFonts w:ascii="Times New Roman" w:eastAsia="Times New Roman" w:hAnsi="Times New Roman" w:cs="Times New Roman"/>
-          <w:kern w:val="0"/>
-          <w14:ligatures w14:val="none"/>
-        </w:rPr>
-        <w:t xml:space="preserve"> </w:t>
+        <w:t xml:space="preserve">: </w:t>
       </w:r>
       <w:r>
         <w:rPr>
@@ -186,44 +164,22 @@
         </w:numPr>
         <w:spacing w:before="100" w:beforeAutospacing="1" w:after="100" w:afterAutospacing="1" w:line="240" w:lineRule="auto"/>
         <w:rPr>
-          <w:rFonts w:ascii="Courier New" w:eastAsia="Times New Roman" w:hAnsi="Courier New" w:cs="Courier New" w:hint="eastAsia"/>
-          <w:kern w:val="0"/>
-          <w:sz w:val="20"/>
-          <w:szCs w:val="20"/>
-          <w14:ligatures w14:val="none"/>
-        </w:rPr>
-      </w:pPr>
-      <w:proofErr w:type="gramStart"/>
-      <w:r>
-        <w:rPr>
-          <w:rFonts w:ascii="Courier New" w:eastAsia="Times New Roman" w:hAnsi="Courier New" w:cs="Courier New"/>
-          <w:kern w:val="0"/>
-          <w:sz w:val="20"/>
-          <w:szCs w:val="20"/>
-          <w14:ligatures w14:val="none"/>
-        </w:rPr>
-        <w:t xml:space="preserve">Partner </w:t>
-      </w:r>
-      <w:r>
-        <w:rPr>
-          <w:rFonts w:ascii="Courier New" w:eastAsia="Times New Roman" w:hAnsi="Courier New" w:cs="Courier New"/>
-          <w:kern w:val="0"/>
-          <w:sz w:val="20"/>
-          <w:szCs w:val="20"/>
-          <w14:ligatures w14:val="none"/>
-        </w:rPr>
-        <w:t>:</w:t>
-      </w:r>
-      <w:proofErr w:type="gramEnd"/>
-      <w:r>
-        <w:rPr>
-          <w:rFonts w:ascii="Courier New" w:eastAsia="Times New Roman" w:hAnsi="Courier New" w:cs="Courier New"/>
-          <w:kern w:val="0"/>
-          <w:sz w:val="20"/>
-          <w:szCs w:val="20"/>
-          <w14:ligatures w14:val="none"/>
-        </w:rPr>
-        <w:t xml:space="preserve"> have par</w:t>
+          <w:rFonts w:ascii="Courier New" w:eastAsia="Times New Roman" w:hAnsi="Courier New" w:cs="Courier New"/>
+          <w:kern w:val="0"/>
+          <w:sz w:val="20"/>
+          <w:szCs w:val="20"/>
+          <w14:ligatures w14:val="none"/>
+        </w:rPr>
+      </w:pPr>
+      <w:r>
+        <w:rPr>
+          <w:rFonts w:ascii="Courier New" w:eastAsia="Times New Roman" w:hAnsi="Courier New" w:cs="Courier New"/>
+          <w:kern w:val="0"/>
+          <w:sz w:val="20"/>
+          <w:szCs w:val="20"/>
+          <w14:ligatures w14:val="none"/>
+        </w:rPr>
+        <w:t>Partner : have par</w:t>
       </w:r>
       <w:r>
         <w:rPr>
@@ -265,12 +221,11 @@
         </w:numPr>
         <w:spacing w:before="100" w:beforeAutospacing="1" w:after="100" w:afterAutospacing="1" w:line="240" w:lineRule="auto"/>
         <w:rPr>
-          <w:rFonts w:ascii="Times New Roman" w:eastAsia="Times New Roman" w:hAnsi="Times New Roman" w:cs="Times New Roman" w:hint="eastAsia"/>
-          <w:kern w:val="0"/>
-          <w14:ligatures w14:val="none"/>
-        </w:rPr>
-      </w:pPr>
-      <w:proofErr w:type="gramStart"/>
+          <w:rFonts w:ascii="Times New Roman" w:eastAsia="Times New Roman" w:hAnsi="Times New Roman" w:cs="Times New Roman"/>
+          <w:kern w:val="0"/>
+          <w14:ligatures w14:val="none"/>
+        </w:rPr>
+      </w:pPr>
       <w:r>
         <w:rPr>
           <w:rFonts w:ascii="Courier New" w:eastAsia="Times New Roman" w:hAnsi="Courier New" w:cs="Courier New"/>
@@ -297,18 +252,7 @@
           <w:szCs w:val="20"/>
           <w14:ligatures w14:val="none"/>
         </w:rPr>
-        <w:t>Any</w:t>
-      </w:r>
-      <w:proofErr w:type="gramEnd"/>
-      <w:r>
-        <w:rPr>
-          <w:rFonts w:ascii="Courier New" w:eastAsia="Times New Roman" w:hAnsi="Courier New" w:cs="Courier New"/>
-          <w:kern w:val="0"/>
-          <w:sz w:val="20"/>
-          <w:szCs w:val="20"/>
-          <w14:ligatures w14:val="none"/>
-        </w:rPr>
-        <w:t xml:space="preserve"> children</w:t>
+        <w:t>Any children</w:t>
       </w:r>
     </w:p>
     <w:p>
@@ -389,7 +333,6 @@
           <w14:ligatures w14:val="none"/>
         </w:rPr>
       </w:pPr>
-      <w:proofErr w:type="gramStart"/>
       <w:r>
         <w:rPr>
           <w:rFonts w:ascii="Courier New" w:eastAsia="Times New Roman" w:hAnsi="Courier New" w:cs="Courier New"/>
@@ -414,48 +357,17 @@
           <w:kern w:val="0"/>
           <w14:ligatures w14:val="none"/>
         </w:rPr>
-        <w:t>:</w:t>
-      </w:r>
-      <w:proofErr w:type="gramEnd"/>
-      <w:r>
-        <w:rPr>
-          <w:rFonts w:ascii="Times New Roman" w:eastAsia="Times New Roman" w:hAnsi="Times New Roman" w:cs="Times New Roman"/>
-          <w:kern w:val="0"/>
-          <w14:ligatures w14:val="none"/>
-        </w:rPr>
-        <w:t xml:space="preserve"> </w:t>
-      </w:r>
-      <w:r>
-        <w:rPr>
-          <w:rFonts w:ascii="Courier New" w:eastAsia="Times New Roman" w:hAnsi="Courier New" w:cs="Courier New"/>
-          <w:kern w:val="0"/>
-          <w:sz w:val="20"/>
-          <w:szCs w:val="20"/>
-          <w14:ligatures w14:val="none"/>
-        </w:rPr>
-        <w:t xml:space="preserve">How long the client </w:t>
-      </w:r>
-      <w:proofErr w:type="gramStart"/>
-      <w:r>
-        <w:rPr>
-          <w:rFonts w:ascii="Courier New" w:eastAsia="Times New Roman" w:hAnsi="Courier New" w:cs="Courier New"/>
-          <w:kern w:val="0"/>
-          <w:sz w:val="20"/>
-          <w:szCs w:val="20"/>
-          <w14:ligatures w14:val="none"/>
-        </w:rPr>
-        <w:t>stay</w:t>
-      </w:r>
-      <w:proofErr w:type="gramEnd"/>
-      <w:r>
-        <w:rPr>
-          <w:rFonts w:ascii="Courier New" w:eastAsia="Times New Roman" w:hAnsi="Courier New" w:cs="Courier New"/>
-          <w:kern w:val="0"/>
-          <w:sz w:val="20"/>
-          <w:szCs w:val="20"/>
-          <w14:ligatures w14:val="none"/>
-        </w:rPr>
-        <w:t xml:space="preserve"> in?</w:t>
+        <w:t xml:space="preserve">: </w:t>
+      </w:r>
+      <w:r>
+        <w:rPr>
+          <w:rFonts w:ascii="Courier New" w:eastAsia="Times New Roman" w:hAnsi="Courier New" w:cs="Courier New"/>
+          <w:kern w:val="0"/>
+          <w:sz w:val="20"/>
+          <w:szCs w:val="20"/>
+          <w14:ligatures w14:val="none"/>
+        </w:rPr>
+        <w:t>How long the client stay in?</w:t>
       </w:r>
     </w:p>
     <w:p>
@@ -523,7 +435,6 @@
           <w14:ligatures w14:val="none"/>
         </w:rPr>
       </w:pPr>
-      <w:proofErr w:type="gramStart"/>
       <w:r>
         <w:rPr>
           <w:rFonts w:ascii="Courier New" w:eastAsia="Times New Roman" w:hAnsi="Courier New" w:cs="Courier New"/>
@@ -550,7 +461,6 @@
         </w:rPr>
         <w:t>:</w:t>
       </w:r>
-      <w:proofErr w:type="gramEnd"/>
     </w:p>
     <w:p>
       <w:pPr>
@@ -606,8 +516,6 @@
           <w14:ligatures w14:val="none"/>
         </w:rPr>
       </w:pPr>
-      <w:proofErr w:type="spellStart"/>
-      <w:proofErr w:type="gramStart"/>
       <w:r>
         <w:rPr>
           <w:rFonts w:ascii="Courier New" w:eastAsia="Times New Roman" w:hAnsi="Courier New" w:cs="Courier New"/>
@@ -618,7 +526,6 @@
         </w:rPr>
         <w:t>PhoneService</w:t>
       </w:r>
-      <w:proofErr w:type="spellEnd"/>
       <w:r>
         <w:rPr>
           <w:rFonts w:ascii="Times New Roman" w:eastAsia="Times New Roman" w:hAnsi="Times New Roman" w:cs="Times New Roman"/>
@@ -633,16 +540,7 @@
           <w:kern w:val="0"/>
           <w14:ligatures w14:val="none"/>
         </w:rPr>
-        <w:t>:</w:t>
-      </w:r>
-      <w:proofErr w:type="gramEnd"/>
-      <w:r>
-        <w:rPr>
-          <w:rFonts w:ascii="Times New Roman" w:eastAsia="Times New Roman" w:hAnsi="Times New Roman" w:cs="Times New Roman"/>
-          <w:kern w:val="0"/>
-          <w14:ligatures w14:val="none"/>
-        </w:rPr>
-        <w:t xml:space="preserve"> </w:t>
+        <w:t xml:space="preserve">: </w:t>
       </w:r>
       <w:r>
         <w:rPr>
@@ -668,8 +566,6 @@
           <w14:ligatures w14:val="none"/>
         </w:rPr>
       </w:pPr>
-      <w:proofErr w:type="spellStart"/>
-      <w:proofErr w:type="gramStart"/>
       <w:r>
         <w:rPr>
           <w:rFonts w:ascii="Courier New" w:eastAsia="Times New Roman" w:hAnsi="Courier New" w:cs="Courier New"/>
@@ -680,7 +576,6 @@
         </w:rPr>
         <w:t>MultipleLines</w:t>
       </w:r>
-      <w:proofErr w:type="spellEnd"/>
       <w:r>
         <w:rPr>
           <w:rFonts w:ascii="Times New Roman" w:eastAsia="Times New Roman" w:hAnsi="Times New Roman" w:cs="Times New Roman"/>
@@ -697,7 +592,6 @@
         </w:rPr>
         <w:t>:</w:t>
       </w:r>
-      <w:proofErr w:type="gramEnd"/>
     </w:p>
     <w:p>
       <w:pPr>
@@ -722,20 +616,8 @@
           <w:szCs w:val="20"/>
           <w14:ligatures w14:val="none"/>
         </w:rPr>
-        <w:t xml:space="preserve">Yes: Have the </w:t>
-      </w:r>
-      <w:proofErr w:type="spellStart"/>
-      <w:r>
-        <w:rPr>
-          <w:rFonts w:ascii="Courier New" w:eastAsia="Times New Roman" w:hAnsi="Courier New" w:cs="Courier New"/>
-          <w:kern w:val="0"/>
-          <w:sz w:val="20"/>
-          <w:szCs w:val="20"/>
-          <w14:ligatures w14:val="none"/>
-        </w:rPr>
-        <w:t>multipleline</w:t>
-      </w:r>
-      <w:proofErr w:type="spellEnd"/>
+        <w:t>Yes: Have the multipleline</w:t>
+      </w:r>
     </w:p>
     <w:p>
       <w:pPr>
@@ -760,29 +642,7 @@
           <w:szCs w:val="20"/>
           <w14:ligatures w14:val="none"/>
         </w:rPr>
-        <w:t xml:space="preserve">No: Don’t have the </w:t>
-      </w:r>
-      <w:proofErr w:type="spellStart"/>
-      <w:r>
-        <w:rPr>
-          <w:rFonts w:ascii="Courier New" w:eastAsia="Times New Roman" w:hAnsi="Courier New" w:cs="Courier New"/>
-          <w:kern w:val="0"/>
-          <w:sz w:val="20"/>
-          <w:szCs w:val="20"/>
-          <w14:ligatures w14:val="none"/>
-        </w:rPr>
-        <w:t>multipleline</w:t>
-      </w:r>
-      <w:proofErr w:type="spellEnd"/>
-      <w:r>
-        <w:rPr>
-          <w:rFonts w:ascii="Courier New" w:eastAsia="Times New Roman" w:hAnsi="Courier New" w:cs="Courier New"/>
-          <w:kern w:val="0"/>
-          <w:sz w:val="20"/>
-          <w:szCs w:val="20"/>
-          <w14:ligatures w14:val="none"/>
-        </w:rPr>
-        <w:t>, but have the phone service</w:t>
+        <w:t>No: Don’t have the multipleline, but have the phone service</w:t>
       </w:r>
     </w:p>
     <w:p>
@@ -826,28 +686,15 @@
           <w14:ligatures w14:val="none"/>
         </w:rPr>
       </w:pPr>
-      <w:proofErr w:type="spellStart"/>
-      <w:proofErr w:type="gramStart"/>
-      <w:r>
-        <w:rPr>
-          <w:rFonts w:ascii="Courier New" w:eastAsia="Times New Roman" w:hAnsi="Courier New" w:cs="Courier New"/>
-          <w:kern w:val="0"/>
-          <w:sz w:val="20"/>
-          <w:szCs w:val="20"/>
-          <w14:ligatures w14:val="none"/>
-        </w:rPr>
-        <w:t>InternetService</w:t>
-      </w:r>
-      <w:proofErr w:type="spellEnd"/>
-      <w:r>
-        <w:rPr>
-          <w:rFonts w:ascii="Courier New" w:eastAsia="Times New Roman" w:hAnsi="Courier New" w:cs="Courier New"/>
-          <w:kern w:val="0"/>
-          <w:sz w:val="20"/>
-          <w:szCs w:val="20"/>
-          <w14:ligatures w14:val="none"/>
-        </w:rPr>
-        <w:t xml:space="preserve"> </w:t>
+      <w:r>
+        <w:rPr>
+          <w:rFonts w:ascii="Courier New" w:eastAsia="Times New Roman" w:hAnsi="Courier New" w:cs="Courier New"/>
+          <w:kern w:val="0"/>
+          <w:sz w:val="20"/>
+          <w:szCs w:val="20"/>
+          <w14:ligatures w14:val="none"/>
+        </w:rPr>
+        <w:t xml:space="preserve">InternetService </w:t>
       </w:r>
       <w:r>
         <w:rPr>
@@ -859,7 +706,6 @@
         </w:rPr>
         <w:t>:</w:t>
       </w:r>
-      <w:proofErr w:type="gramEnd"/>
     </w:p>
     <w:p>
       <w:pPr>
@@ -954,28 +800,15 @@
           <w14:ligatures w14:val="none"/>
         </w:rPr>
       </w:pPr>
-      <w:proofErr w:type="spellStart"/>
-      <w:proofErr w:type="gramStart"/>
-      <w:r>
-        <w:rPr>
-          <w:rFonts w:ascii="Courier New" w:eastAsia="Times New Roman" w:hAnsi="Courier New" w:cs="Courier New"/>
-          <w:kern w:val="0"/>
-          <w:sz w:val="20"/>
-          <w:szCs w:val="20"/>
-          <w14:ligatures w14:val="none"/>
-        </w:rPr>
-        <w:t>OnlineSecurity</w:t>
-      </w:r>
-      <w:proofErr w:type="spellEnd"/>
-      <w:r>
-        <w:rPr>
-          <w:rFonts w:ascii="Courier New" w:eastAsia="Times New Roman" w:hAnsi="Courier New" w:cs="Courier New"/>
-          <w:kern w:val="0"/>
-          <w:sz w:val="20"/>
-          <w:szCs w:val="20"/>
-          <w14:ligatures w14:val="none"/>
-        </w:rPr>
-        <w:t xml:space="preserve"> </w:t>
+      <w:r>
+        <w:rPr>
+          <w:rFonts w:ascii="Courier New" w:eastAsia="Times New Roman" w:hAnsi="Courier New" w:cs="Courier New"/>
+          <w:kern w:val="0"/>
+          <w:sz w:val="20"/>
+          <w:szCs w:val="20"/>
+          <w14:ligatures w14:val="none"/>
+        </w:rPr>
+        <w:t xml:space="preserve">OnlineSecurity </w:t>
       </w:r>
       <w:r>
         <w:rPr>
@@ -987,7 +820,6 @@
         </w:rPr>
         <w:t>:</w:t>
       </w:r>
-      <w:proofErr w:type="gramEnd"/>
     </w:p>
     <w:p>
       <w:pPr>
@@ -1020,27 +852,15 @@
           <w14:ligatures w14:val="none"/>
         </w:rPr>
       </w:pPr>
-      <w:proofErr w:type="spellStart"/>
-      <w:r>
-        <w:rPr>
-          <w:rFonts w:ascii="Courier New" w:eastAsia="Times New Roman" w:hAnsi="Courier New" w:cs="Courier New"/>
-          <w:kern w:val="0"/>
-          <w:sz w:val="20"/>
-          <w:szCs w:val="20"/>
-          <w14:ligatures w14:val="none"/>
-        </w:rPr>
-        <w:t>OnlineBackup</w:t>
-      </w:r>
-      <w:proofErr w:type="spellEnd"/>
-      <w:r>
-        <w:rPr>
-          <w:rFonts w:ascii="Courier New" w:eastAsia="Times New Roman" w:hAnsi="Courier New" w:cs="Courier New"/>
-          <w:kern w:val="0"/>
-          <w:sz w:val="20"/>
-          <w:szCs w:val="20"/>
-          <w14:ligatures w14:val="none"/>
-        </w:rPr>
-        <w:t xml:space="preserve"> </w:t>
+      <w:r>
+        <w:rPr>
+          <w:rFonts w:ascii="Courier New" w:eastAsia="Times New Roman" w:hAnsi="Courier New" w:cs="Courier New"/>
+          <w:kern w:val="0"/>
+          <w:sz w:val="20"/>
+          <w:szCs w:val="20"/>
+          <w14:ligatures w14:val="none"/>
+        </w:rPr>
+        <w:t xml:space="preserve">OnlineBackup </w:t>
       </w:r>
     </w:p>
     <w:p>
@@ -1058,27 +878,15 @@
           <w14:ligatures w14:val="none"/>
         </w:rPr>
       </w:pPr>
-      <w:proofErr w:type="spellStart"/>
-      <w:r>
-        <w:rPr>
-          <w:rFonts w:ascii="Courier New" w:eastAsia="Times New Roman" w:hAnsi="Courier New" w:cs="Courier New"/>
-          <w:kern w:val="0"/>
-          <w:sz w:val="20"/>
-          <w:szCs w:val="20"/>
-          <w14:ligatures w14:val="none"/>
-        </w:rPr>
-        <w:t>DeviceProtection</w:t>
-      </w:r>
-      <w:proofErr w:type="spellEnd"/>
-      <w:r>
-        <w:rPr>
-          <w:rFonts w:ascii="Courier New" w:eastAsia="Times New Roman" w:hAnsi="Courier New" w:cs="Courier New"/>
-          <w:kern w:val="0"/>
-          <w:sz w:val="20"/>
-          <w:szCs w:val="20"/>
-          <w14:ligatures w14:val="none"/>
-        </w:rPr>
-        <w:t xml:space="preserve"> </w:t>
+      <w:r>
+        <w:rPr>
+          <w:rFonts w:ascii="Courier New" w:eastAsia="Times New Roman" w:hAnsi="Courier New" w:cs="Courier New"/>
+          <w:kern w:val="0"/>
+          <w:sz w:val="20"/>
+          <w:szCs w:val="20"/>
+          <w14:ligatures w14:val="none"/>
+        </w:rPr>
+        <w:t xml:space="preserve">DeviceProtection </w:t>
       </w:r>
     </w:p>
     <w:p>
@@ -1096,27 +904,15 @@
           <w14:ligatures w14:val="none"/>
         </w:rPr>
       </w:pPr>
-      <w:proofErr w:type="spellStart"/>
-      <w:r>
-        <w:rPr>
-          <w:rFonts w:ascii="Courier New" w:eastAsia="Times New Roman" w:hAnsi="Courier New" w:cs="Courier New"/>
-          <w:kern w:val="0"/>
-          <w:sz w:val="20"/>
-          <w:szCs w:val="20"/>
-          <w14:ligatures w14:val="none"/>
-        </w:rPr>
-        <w:t>TechSupport</w:t>
-      </w:r>
-      <w:proofErr w:type="spellEnd"/>
-      <w:r>
-        <w:rPr>
-          <w:rFonts w:ascii="Courier New" w:eastAsia="Times New Roman" w:hAnsi="Courier New" w:cs="Courier New"/>
-          <w:kern w:val="0"/>
-          <w:sz w:val="20"/>
-          <w:szCs w:val="20"/>
-          <w14:ligatures w14:val="none"/>
-        </w:rPr>
-        <w:t xml:space="preserve"> </w:t>
+      <w:r>
+        <w:rPr>
+          <w:rFonts w:ascii="Courier New" w:eastAsia="Times New Roman" w:hAnsi="Courier New" w:cs="Courier New"/>
+          <w:kern w:val="0"/>
+          <w:sz w:val="20"/>
+          <w:szCs w:val="20"/>
+          <w14:ligatures w14:val="none"/>
+        </w:rPr>
+        <w:t xml:space="preserve">TechSupport </w:t>
       </w:r>
     </w:p>
     <w:p>
@@ -1134,27 +930,15 @@
           <w14:ligatures w14:val="none"/>
         </w:rPr>
       </w:pPr>
-      <w:proofErr w:type="spellStart"/>
-      <w:r>
-        <w:rPr>
-          <w:rFonts w:ascii="Courier New" w:eastAsia="Times New Roman" w:hAnsi="Courier New" w:cs="Courier New"/>
-          <w:kern w:val="0"/>
-          <w:sz w:val="20"/>
-          <w:szCs w:val="20"/>
-          <w14:ligatures w14:val="none"/>
-        </w:rPr>
-        <w:t>StreamingTV</w:t>
-      </w:r>
-      <w:proofErr w:type="spellEnd"/>
-      <w:r>
-        <w:rPr>
-          <w:rFonts w:ascii="Courier New" w:eastAsia="Times New Roman" w:hAnsi="Courier New" w:cs="Courier New"/>
-          <w:kern w:val="0"/>
-          <w:sz w:val="20"/>
-          <w:szCs w:val="20"/>
-          <w14:ligatures w14:val="none"/>
-        </w:rPr>
-        <w:t xml:space="preserve"> </w:t>
+      <w:r>
+        <w:rPr>
+          <w:rFonts w:ascii="Courier New" w:eastAsia="Times New Roman" w:hAnsi="Courier New" w:cs="Courier New"/>
+          <w:kern w:val="0"/>
+          <w:sz w:val="20"/>
+          <w:szCs w:val="20"/>
+          <w14:ligatures w14:val="none"/>
+        </w:rPr>
+        <w:t xml:space="preserve">StreamingTV </w:t>
       </w:r>
     </w:p>
     <w:p>
@@ -1172,27 +956,15 @@
           <w14:ligatures w14:val="none"/>
         </w:rPr>
       </w:pPr>
-      <w:proofErr w:type="spellStart"/>
-      <w:r>
-        <w:rPr>
-          <w:rFonts w:ascii="Courier New" w:eastAsia="Times New Roman" w:hAnsi="Courier New" w:cs="Courier New"/>
-          <w:kern w:val="0"/>
-          <w:sz w:val="20"/>
-          <w:szCs w:val="20"/>
-          <w14:ligatures w14:val="none"/>
-        </w:rPr>
-        <w:t>StreamingMovies</w:t>
-      </w:r>
-      <w:proofErr w:type="spellEnd"/>
-      <w:r>
-        <w:rPr>
-          <w:rFonts w:ascii="Courier New" w:eastAsia="Times New Roman" w:hAnsi="Courier New" w:cs="Courier New"/>
-          <w:kern w:val="0"/>
-          <w:sz w:val="20"/>
-          <w:szCs w:val="20"/>
-          <w14:ligatures w14:val="none"/>
-        </w:rPr>
-        <w:t xml:space="preserve"> </w:t>
+      <w:r>
+        <w:rPr>
+          <w:rFonts w:ascii="Courier New" w:eastAsia="Times New Roman" w:hAnsi="Courier New" w:cs="Courier New"/>
+          <w:kern w:val="0"/>
+          <w:sz w:val="20"/>
+          <w:szCs w:val="20"/>
+          <w14:ligatures w14:val="none"/>
+        </w:rPr>
+        <w:t xml:space="preserve">StreamingMovies </w:t>
       </w:r>
     </w:p>
     <w:p>
@@ -1247,7 +1019,6 @@
           <w14:ligatures w14:val="none"/>
         </w:rPr>
       </w:pPr>
-      <w:proofErr w:type="spellStart"/>
       <w:r>
         <w:rPr>
           <w:rFonts w:ascii="Courier New" w:eastAsia="Times New Roman" w:hAnsi="Courier New" w:cs="Courier New"/>
@@ -1258,7 +1029,6 @@
         </w:rPr>
         <w:t>PaperlessBilling</w:t>
       </w:r>
-      <w:proofErr w:type="spellEnd"/>
       <w:r>
         <w:rPr>
           <w:rFonts w:ascii="Times New Roman" w:eastAsia="Times New Roman" w:hAnsi="Times New Roman" w:cs="Times New Roman"/>
@@ -1281,7 +1051,6 @@
           <w14:ligatures w14:val="none"/>
         </w:rPr>
       </w:pPr>
-      <w:proofErr w:type="spellStart"/>
       <w:r>
         <w:rPr>
           <w:rFonts w:ascii="Courier New" w:eastAsia="Times New Roman" w:hAnsi="Courier New" w:cs="Courier New"/>
@@ -1292,7 +1061,6 @@
         </w:rPr>
         <w:t>PaymentMethod</w:t>
       </w:r>
-      <w:proofErr w:type="spellEnd"/>
       <w:r>
         <w:rPr>
           <w:rFonts w:ascii="Times New Roman" w:eastAsia="Times New Roman" w:hAnsi="Times New Roman" w:cs="Times New Roman"/>
@@ -1315,7 +1083,6 @@
           <w14:ligatures w14:val="none"/>
         </w:rPr>
       </w:pPr>
-      <w:proofErr w:type="spellStart"/>
       <w:r>
         <w:rPr>
           <w:rFonts w:ascii="Courier New" w:eastAsia="Times New Roman" w:hAnsi="Courier New" w:cs="Courier New"/>
@@ -1326,7 +1093,6 @@
         </w:rPr>
         <w:t>MonthlyCharges</w:t>
       </w:r>
-      <w:proofErr w:type="spellEnd"/>
       <w:r>
         <w:rPr>
           <w:rFonts w:ascii="Times New Roman" w:eastAsia="Times New Roman" w:hAnsi="Times New Roman" w:cs="Times New Roman"/>
@@ -1349,7 +1115,6 @@
           <w14:ligatures w14:val="none"/>
         </w:rPr>
       </w:pPr>
-      <w:proofErr w:type="spellStart"/>
       <w:r>
         <w:rPr>
           <w:rFonts w:ascii="Courier New" w:eastAsia="Times New Roman" w:hAnsi="Courier New" w:cs="Courier New"/>
@@ -1360,7 +1125,6 @@
         </w:rPr>
         <w:t>TotalCharges</w:t>
       </w:r>
-      <w:proofErr w:type="spellEnd"/>
       <w:r>
         <w:rPr>
           <w:rFonts w:ascii="Times New Roman" w:eastAsia="Times New Roman" w:hAnsi="Times New Roman" w:cs="Times New Roman"/>
@@ -1446,31 +1210,18 @@
     </w:p>
     <w:p/>
     <w:p>
-      <w:proofErr w:type="spellStart"/>
-      <w:r>
-        <w:t>value_</w:t>
-      </w:r>
-      <w:proofErr w:type="gramStart"/>
-      <w:r>
-        <w:t>counts</w:t>
-      </w:r>
-      <w:proofErr w:type="spellEnd"/>
-      <w:r>
-        <w:t>()</w:t>
-      </w:r>
-      <w:r>
-        <w:t xml:space="preserve"> :</w:t>
-      </w:r>
-      <w:proofErr w:type="gramEnd"/>
-      <w:r>
-        <w:t xml:space="preserve"> </w:t>
-      </w:r>
-      <w:r>
-        <w:t>Count the number of times each value appears</w:t>
-      </w:r>
-    </w:p>
-    <w:p>
-      <w:r>
+      <w:r>
+        <w:t>value_counts() :</w:t>
+      </w:r>
+      <w:r>
+        <w:t xml:space="preserve"> Count the number of times each value appears</w:t>
+      </w:r>
+    </w:p>
+    <w:p>
+      <w:r>
+        <w:rPr>
+          <w:noProof/>
+        </w:rPr>
         <w:drawing>
           <wp:inline distT="0" distB="0" distL="0" distR="0" wp14:anchorId="40C27526" wp14:editId="7F15078C">
             <wp:extent cx="3403600" cy="1803400"/>
@@ -1524,6 +1275,1617 @@
           <w:lang w:val="en-US"/>
         </w:rPr>
       </w:pPr>
+      <w:r>
+        <w:rPr>
+          <w:lang w:val="en-US"/>
+        </w:rPr>
+        <w:t>Day 5 Question:</w:t>
+      </w:r>
+    </w:p>
+    <w:p>
+      <w:pPr>
+        <w:spacing w:before="100" w:beforeAutospacing="1" w:after="100" w:afterAutospacing="1" w:line="240" w:lineRule="auto"/>
+        <w:outlineLvl w:val="1"/>
+        <w:rPr>
+          <w:rFonts w:ascii="Times New Roman" w:eastAsia="Times New Roman" w:hAnsi="Times New Roman" w:cs="Times New Roman"/>
+          <w:b/>
+          <w:bCs/>
+          <w:kern w:val="0"/>
+          <w:sz w:val="36"/>
+          <w:szCs w:val="36"/>
+          <w14:ligatures w14:val="none"/>
+        </w:rPr>
+      </w:pPr>
+      <w:r>
+        <w:rPr>
+          <w:rFonts w:ascii="Times New Roman" w:eastAsia="Times New Roman" w:hAnsi="Times New Roman" w:cs="Times New Roman"/>
+          <w:b/>
+          <w:bCs/>
+          <w:kern w:val="0"/>
+          <w:sz w:val="36"/>
+          <w:szCs w:val="36"/>
+          <w14:ligatures w14:val="none"/>
+        </w:rPr>
+        <w:t xml:space="preserve">1. </w:t>
+      </w:r>
+      <w:r>
+        <w:rPr>
+          <w:rFonts w:ascii="Heiti TC" w:eastAsia="Heiti TC" w:hAnsi="Heiti TC" w:cs="Heiti TC" w:hint="eastAsia"/>
+          <w:b/>
+          <w:bCs/>
+          <w:kern w:val="0"/>
+          <w:sz w:val="36"/>
+          <w:szCs w:val="36"/>
+          <w14:ligatures w14:val="none"/>
+        </w:rPr>
+        <w:t>為什麼</w:t>
+      </w:r>
+      <w:r>
+        <w:rPr>
+          <w:rFonts w:ascii="Times New Roman" w:eastAsia="Times New Roman" w:hAnsi="Times New Roman" w:cs="Times New Roman"/>
+          <w:b/>
+          <w:bCs/>
+          <w:kern w:val="0"/>
+          <w:sz w:val="36"/>
+          <w:szCs w:val="36"/>
+          <w14:ligatures w14:val="none"/>
+        </w:rPr>
+        <w:t xml:space="preserve"> </w:t>
+      </w:r>
+      <w:r>
+        <w:rPr>
+          <w:rFonts w:ascii="Courier New" w:eastAsia="Times New Roman" w:hAnsi="Courier New" w:cs="Courier New"/>
+          <w:b/>
+          <w:bCs/>
+          <w:kern w:val="0"/>
+          <w:sz w:val="20"/>
+          <w:szCs w:val="20"/>
+          <w14:ligatures w14:val="none"/>
+        </w:rPr>
+        <w:t>TotalCharges</w:t>
+      </w:r>
+      <w:r>
+        <w:rPr>
+          <w:rFonts w:ascii="Times New Roman" w:eastAsia="Times New Roman" w:hAnsi="Times New Roman" w:cs="Times New Roman"/>
+          <w:b/>
+          <w:bCs/>
+          <w:kern w:val="0"/>
+          <w:sz w:val="36"/>
+          <w:szCs w:val="36"/>
+          <w14:ligatures w14:val="none"/>
+        </w:rPr>
+        <w:t xml:space="preserve"> </w:t>
+      </w:r>
+      <w:r>
+        <w:rPr>
+          <w:rFonts w:ascii="Heiti TC" w:eastAsia="Heiti TC" w:hAnsi="Heiti TC" w:cs="Heiti TC" w:hint="eastAsia"/>
+          <w:b/>
+          <w:bCs/>
+          <w:kern w:val="0"/>
+          <w:sz w:val="36"/>
+          <w:szCs w:val="36"/>
+          <w14:ligatures w14:val="none"/>
+        </w:rPr>
+        <w:t>一開始可能是</w:t>
+      </w:r>
+      <w:r>
+        <w:rPr>
+          <w:rFonts w:ascii="Times New Roman" w:eastAsia="Times New Roman" w:hAnsi="Times New Roman" w:cs="Times New Roman"/>
+          <w:b/>
+          <w:bCs/>
+          <w:kern w:val="0"/>
+          <w:sz w:val="36"/>
+          <w:szCs w:val="36"/>
+          <w14:ligatures w14:val="none"/>
+        </w:rPr>
+        <w:t xml:space="preserve"> </w:t>
+      </w:r>
+      <w:r>
+        <w:rPr>
+          <w:rFonts w:ascii="Courier New" w:eastAsia="Times New Roman" w:hAnsi="Courier New" w:cs="Courier New"/>
+          <w:b/>
+          <w:bCs/>
+          <w:kern w:val="0"/>
+          <w:sz w:val="20"/>
+          <w:szCs w:val="20"/>
+          <w14:ligatures w14:val="none"/>
+        </w:rPr>
+        <w:t>object</w:t>
+      </w:r>
+      <w:r>
+        <w:rPr>
+          <w:rFonts w:ascii="Heiti TC" w:eastAsia="Heiti TC" w:hAnsi="Heiti TC" w:cs="Heiti TC"/>
+          <w:b/>
+          <w:bCs/>
+          <w:kern w:val="0"/>
+          <w:sz w:val="36"/>
+          <w:szCs w:val="36"/>
+          <w14:ligatures w14:val="none"/>
+        </w:rPr>
+        <w:t>？</w:t>
+      </w:r>
+    </w:p>
+    <w:p>
+      <w:pPr>
+        <w:spacing w:before="100" w:beforeAutospacing="1" w:after="100" w:afterAutospacing="1" w:line="240" w:lineRule="auto"/>
+        <w:rPr>
+          <w:rFonts w:ascii="Times New Roman" w:eastAsia="Times New Roman" w:hAnsi="Times New Roman" w:cs="Times New Roman"/>
+          <w:kern w:val="0"/>
+          <w14:ligatures w14:val="none"/>
+        </w:rPr>
+      </w:pPr>
+      <w:r>
+        <w:rPr>
+          <w:rFonts w:ascii="Heiti TC" w:eastAsia="Heiti TC" w:hAnsi="Heiti TC" w:cs="Heiti TC" w:hint="eastAsia"/>
+          <w:kern w:val="0"/>
+          <w14:ligatures w14:val="none"/>
+        </w:rPr>
+        <w:t>你答</w:t>
+      </w:r>
+      <w:r>
+        <w:rPr>
+          <w:rFonts w:ascii="Heiti TC" w:eastAsia="Heiti TC" w:hAnsi="Heiti TC" w:cs="Heiti TC"/>
+          <w:kern w:val="0"/>
+          <w14:ligatures w14:val="none"/>
+        </w:rPr>
+        <w:t>：</w:t>
+      </w:r>
+    </w:p>
+    <w:p>
+      <w:pPr>
+        <w:spacing w:before="100" w:beforeAutospacing="1" w:after="100" w:afterAutospacing="1" w:line="240" w:lineRule="auto"/>
+        <w:rPr>
+          <w:rFonts w:ascii="Times New Roman" w:eastAsia="Times New Roman" w:hAnsi="Times New Roman" w:cs="Times New Roman"/>
+          <w:kern w:val="0"/>
+          <w14:ligatures w14:val="none"/>
+        </w:rPr>
+      </w:pPr>
+      <w:r>
+        <w:rPr>
+          <w:rFonts w:ascii="Heiti TC" w:eastAsia="Heiti TC" w:hAnsi="Heiti TC" w:cs="Heiti TC" w:hint="eastAsia"/>
+          <w:kern w:val="0"/>
+          <w14:ligatures w14:val="none"/>
+        </w:rPr>
+        <w:t>用文字的方式去輸</w:t>
+      </w:r>
+      <w:r>
+        <w:rPr>
+          <w:rFonts w:ascii="Heiti TC" w:eastAsia="Heiti TC" w:hAnsi="Heiti TC" w:cs="Heiti TC"/>
+          <w:kern w:val="0"/>
+          <w14:ligatures w14:val="none"/>
+        </w:rPr>
+        <w:t>入</w:t>
+      </w:r>
+    </w:p>
+    <w:p>
+      <w:pPr>
+        <w:spacing w:before="100" w:beforeAutospacing="1" w:after="100" w:afterAutospacing="1" w:line="240" w:lineRule="auto"/>
+        <w:rPr>
+          <w:rFonts w:ascii="Times New Roman" w:eastAsia="Times New Roman" w:hAnsi="Times New Roman" w:cs="Times New Roman"/>
+          <w:kern w:val="0"/>
+          <w14:ligatures w14:val="none"/>
+        </w:rPr>
+      </w:pPr>
+      <w:r>
+        <w:rPr>
+          <w:rFonts w:ascii="Heiti TC" w:eastAsia="Heiti TC" w:hAnsi="Heiti TC" w:cs="Heiti TC" w:hint="eastAsia"/>
+          <w:kern w:val="0"/>
+          <w14:ligatures w14:val="none"/>
+        </w:rPr>
+        <w:t>這個方向是對的，但更完整一點應該說</w:t>
+      </w:r>
+      <w:r>
+        <w:rPr>
+          <w:rFonts w:ascii="Heiti TC" w:eastAsia="Heiti TC" w:hAnsi="Heiti TC" w:cs="Heiti TC"/>
+          <w:kern w:val="0"/>
+          <w14:ligatures w14:val="none"/>
+        </w:rPr>
+        <w:t>：</w:t>
+      </w:r>
+    </w:p>
+    <w:p>
+      <w:pPr>
+        <w:spacing w:before="100" w:beforeAutospacing="1" w:after="100" w:afterAutospacing="1" w:line="240" w:lineRule="auto"/>
+        <w:rPr>
+          <w:rFonts w:ascii="Times New Roman" w:eastAsia="Times New Roman" w:hAnsi="Times New Roman" w:cs="Times New Roman"/>
+          <w:kern w:val="0"/>
+          <w14:ligatures w14:val="none"/>
+        </w:rPr>
+      </w:pPr>
+      <w:r>
+        <w:rPr>
+          <w:rFonts w:ascii="Heiti TC" w:eastAsia="Heiti TC" w:hAnsi="Heiti TC" w:cs="Heiti TC" w:hint="eastAsia"/>
+          <w:b/>
+          <w:bCs/>
+          <w:kern w:val="0"/>
+          <w14:ligatures w14:val="none"/>
+        </w:rPr>
+        <w:t>更好版本：</w:t>
+      </w:r>
+      <w:r>
+        <w:rPr>
+          <w:rFonts w:ascii="Times New Roman" w:eastAsia="Times New Roman" w:hAnsi="Times New Roman" w:cs="Times New Roman"/>
+          <w:kern w:val="0"/>
+          <w14:ligatures w14:val="none"/>
+        </w:rPr>
+        <w:br/>
+      </w:r>
+      <w:r>
+        <w:rPr>
+          <w:rFonts w:ascii="Courier New" w:eastAsia="Times New Roman" w:hAnsi="Courier New" w:cs="Courier New"/>
+          <w:kern w:val="0"/>
+          <w:sz w:val="20"/>
+          <w:szCs w:val="20"/>
+          <w14:ligatures w14:val="none"/>
+        </w:rPr>
+        <w:t>TotalCharges</w:t>
+      </w:r>
+      <w:r>
+        <w:rPr>
+          <w:rFonts w:ascii="Times New Roman" w:eastAsia="Times New Roman" w:hAnsi="Times New Roman" w:cs="Times New Roman"/>
+          <w:kern w:val="0"/>
+          <w14:ligatures w14:val="none"/>
+        </w:rPr>
+        <w:t xml:space="preserve"> is initially stored as </w:t>
+      </w:r>
+      <w:r>
+        <w:rPr>
+          <w:rFonts w:ascii="Courier New" w:eastAsia="Times New Roman" w:hAnsi="Courier New" w:cs="Courier New"/>
+          <w:kern w:val="0"/>
+          <w:sz w:val="20"/>
+          <w:szCs w:val="20"/>
+          <w14:ligatures w14:val="none"/>
+        </w:rPr>
+        <w:t>object</w:t>
+      </w:r>
+      <w:r>
+        <w:rPr>
+          <w:rFonts w:ascii="Times New Roman" w:eastAsia="Times New Roman" w:hAnsi="Times New Roman" w:cs="Times New Roman"/>
+          <w:kern w:val="0"/>
+          <w14:ligatures w14:val="none"/>
+        </w:rPr>
+        <w:t xml:space="preserve"> because some rows contain blank strings such as </w:t>
+      </w:r>
+      <w:r>
+        <w:rPr>
+          <w:rFonts w:ascii="Courier New" w:eastAsia="Times New Roman" w:hAnsi="Courier New" w:cs="Courier New"/>
+          <w:kern w:val="0"/>
+          <w:sz w:val="20"/>
+          <w:szCs w:val="20"/>
+          <w14:ligatures w14:val="none"/>
+        </w:rPr>
+        <w:t>" "</w:t>
+      </w:r>
+      <w:r>
+        <w:rPr>
+          <w:rFonts w:ascii="Times New Roman" w:eastAsia="Times New Roman" w:hAnsi="Times New Roman" w:cs="Times New Roman"/>
+          <w:kern w:val="0"/>
+          <w14:ligatures w14:val="none"/>
+        </w:rPr>
+        <w:t xml:space="preserve"> instead of proper numeric values. As a result, pandas reads the whole column as an object type.</w:t>
+      </w:r>
+    </w:p>
+    <w:p>
+      <w:pPr>
+        <w:spacing w:before="100" w:beforeAutospacing="1" w:after="100" w:afterAutospacing="1" w:line="240" w:lineRule="auto"/>
+        <w:rPr>
+          <w:rFonts w:ascii="Times New Roman" w:eastAsia="Times New Roman" w:hAnsi="Times New Roman" w:cs="Times New Roman"/>
+          <w:kern w:val="0"/>
+          <w14:ligatures w14:val="none"/>
+        </w:rPr>
+      </w:pPr>
+      <w:r>
+        <w:rPr>
+          <w:rFonts w:ascii="Heiti TC" w:eastAsia="Heiti TC" w:hAnsi="Heiti TC" w:cs="Heiti TC" w:hint="eastAsia"/>
+          <w:b/>
+          <w:bCs/>
+          <w:kern w:val="0"/>
+          <w14:ligatures w14:val="none"/>
+        </w:rPr>
+        <w:t>中文理解：</w:t>
+      </w:r>
+      <w:r>
+        <w:rPr>
+          <w:rFonts w:ascii="Times New Roman" w:eastAsia="Times New Roman" w:hAnsi="Times New Roman" w:cs="Times New Roman"/>
+          <w:kern w:val="0"/>
+          <w14:ligatures w14:val="none"/>
+        </w:rPr>
+        <w:br/>
+      </w:r>
+      <w:r>
+        <w:rPr>
+          <w:rFonts w:ascii="Heiti TC" w:eastAsia="Heiti TC" w:hAnsi="Heiti TC" w:cs="Heiti TC" w:hint="eastAsia"/>
+          <w:kern w:val="0"/>
+          <w14:ligatures w14:val="none"/>
+        </w:rPr>
+        <w:t>因為</w:t>
+      </w:r>
+      <w:r>
+        <w:rPr>
+          <w:rFonts w:ascii="Times New Roman" w:eastAsia="Times New Roman" w:hAnsi="Times New Roman" w:cs="Times New Roman"/>
+          <w:kern w:val="0"/>
+          <w14:ligatures w14:val="none"/>
+        </w:rPr>
+        <w:t xml:space="preserve"> </w:t>
+      </w:r>
+      <w:r>
+        <w:rPr>
+          <w:rFonts w:ascii="Courier New" w:eastAsia="Times New Roman" w:hAnsi="Courier New" w:cs="Courier New"/>
+          <w:kern w:val="0"/>
+          <w:sz w:val="20"/>
+          <w:szCs w:val="20"/>
+          <w14:ligatures w14:val="none"/>
+        </w:rPr>
+        <w:t>TotalCharges</w:t>
+      </w:r>
+      <w:r>
+        <w:rPr>
+          <w:rFonts w:ascii="Times New Roman" w:eastAsia="Times New Roman" w:hAnsi="Times New Roman" w:cs="Times New Roman"/>
+          <w:kern w:val="0"/>
+          <w14:ligatures w14:val="none"/>
+        </w:rPr>
+        <w:t xml:space="preserve"> </w:t>
+      </w:r>
+      <w:r>
+        <w:rPr>
+          <w:rFonts w:ascii="Heiti TC" w:eastAsia="Heiti TC" w:hAnsi="Heiti TC" w:cs="Heiti TC" w:hint="eastAsia"/>
+          <w:kern w:val="0"/>
+          <w14:ligatures w14:val="none"/>
+        </w:rPr>
+        <w:t>這欄裡有些資料不是正常數字，而是空白字串</w:t>
+      </w:r>
+      <w:r>
+        <w:rPr>
+          <w:rFonts w:ascii="Times New Roman" w:eastAsia="Times New Roman" w:hAnsi="Times New Roman" w:cs="Times New Roman"/>
+          <w:kern w:val="0"/>
+          <w14:ligatures w14:val="none"/>
+        </w:rPr>
+        <w:t xml:space="preserve"> </w:t>
+      </w:r>
+      <w:r>
+        <w:rPr>
+          <w:rFonts w:ascii="Courier New" w:eastAsia="Times New Roman" w:hAnsi="Courier New" w:cs="Courier New"/>
+          <w:kern w:val="0"/>
+          <w:sz w:val="20"/>
+          <w:szCs w:val="20"/>
+          <w14:ligatures w14:val="none"/>
+        </w:rPr>
+        <w:t>" "</w:t>
+      </w:r>
+      <w:r>
+        <w:rPr>
+          <w:rFonts w:ascii="Heiti TC" w:eastAsia="Heiti TC" w:hAnsi="Heiti TC" w:cs="Heiti TC" w:hint="eastAsia"/>
+          <w:kern w:val="0"/>
+          <w14:ligatures w14:val="none"/>
+        </w:rPr>
+        <w:t>，所以</w:t>
+      </w:r>
+      <w:r>
+        <w:rPr>
+          <w:rFonts w:ascii="Times New Roman" w:eastAsia="Times New Roman" w:hAnsi="Times New Roman" w:cs="Times New Roman"/>
+          <w:kern w:val="0"/>
+          <w14:ligatures w14:val="none"/>
+        </w:rPr>
+        <w:t xml:space="preserve"> pandas </w:t>
+      </w:r>
+      <w:r>
+        <w:rPr>
+          <w:rFonts w:ascii="Heiti TC" w:eastAsia="Heiti TC" w:hAnsi="Heiti TC" w:cs="Heiti TC" w:hint="eastAsia"/>
+          <w:kern w:val="0"/>
+          <w14:ligatures w14:val="none"/>
+        </w:rPr>
+        <w:t>會把整欄當成</w:t>
+      </w:r>
+      <w:r>
+        <w:rPr>
+          <w:rFonts w:ascii="Times New Roman" w:eastAsia="Times New Roman" w:hAnsi="Times New Roman" w:cs="Times New Roman"/>
+          <w:kern w:val="0"/>
+          <w14:ligatures w14:val="none"/>
+        </w:rPr>
+        <w:t xml:space="preserve"> </w:t>
+      </w:r>
+      <w:r>
+        <w:rPr>
+          <w:rFonts w:ascii="Courier New" w:eastAsia="Times New Roman" w:hAnsi="Courier New" w:cs="Courier New"/>
+          <w:kern w:val="0"/>
+          <w:sz w:val="20"/>
+          <w:szCs w:val="20"/>
+          <w14:ligatures w14:val="none"/>
+        </w:rPr>
+        <w:t>object</w:t>
+      </w:r>
+      <w:r>
+        <w:rPr>
+          <w:rFonts w:ascii="Heiti TC" w:eastAsia="Heiti TC" w:hAnsi="Heiti TC" w:cs="Heiti TC" w:hint="eastAsia"/>
+          <w:kern w:val="0"/>
+          <w14:ligatures w14:val="none"/>
+        </w:rPr>
+        <w:t>，而不是</w:t>
+      </w:r>
+      <w:r>
+        <w:rPr>
+          <w:rFonts w:ascii="Times New Roman" w:eastAsia="Times New Roman" w:hAnsi="Times New Roman" w:cs="Times New Roman"/>
+          <w:kern w:val="0"/>
+          <w14:ligatures w14:val="none"/>
+        </w:rPr>
+        <w:t xml:space="preserve"> numeric</w:t>
+      </w:r>
+      <w:r>
+        <w:rPr>
+          <w:rFonts w:ascii="Heiti TC" w:eastAsia="Heiti TC" w:hAnsi="Heiti TC" w:cs="Heiti TC"/>
+          <w:kern w:val="0"/>
+          <w14:ligatures w14:val="none"/>
+        </w:rPr>
+        <w:t>。</w:t>
+      </w:r>
+    </w:p>
+    <w:p>
+      <w:pPr>
+        <w:spacing w:after="0" w:line="240" w:lineRule="auto"/>
+        <w:rPr>
+          <w:rFonts w:ascii="Times New Roman" w:eastAsia="Times New Roman" w:hAnsi="Times New Roman" w:cs="Times New Roman"/>
+          <w:kern w:val="0"/>
+          <w14:ligatures w14:val="none"/>
+        </w:rPr>
+      </w:pPr>
+      <w:r>
+        <w:rPr>
+          <w:rFonts w:ascii="Times New Roman" w:eastAsia="Times New Roman" w:hAnsi="Times New Roman" w:cs="Times New Roman"/>
+          <w:noProof/>
+          <w:kern w:val="0"/>
+        </w:rPr>
+        <w:pict w14:anchorId="3A8A6C36">
+          <v:rect id="_x0000_i1027" alt="" style="width:451.3pt;height:.05pt;mso-width-percent:0;mso-height-percent:0;mso-width-percent:0;mso-height-percent:0" o:hralign="center" o:hrstd="t" o:hr="t" fillcolor="#a0a0a0" stroked="f"/>
+        </w:pict>
+      </w:r>
+    </w:p>
+    <w:p>
+      <w:pPr>
+        <w:spacing w:before="100" w:beforeAutospacing="1" w:after="100" w:afterAutospacing="1" w:line="240" w:lineRule="auto"/>
+        <w:outlineLvl w:val="1"/>
+        <w:rPr>
+          <w:rFonts w:ascii="Times New Roman" w:eastAsia="Times New Roman" w:hAnsi="Times New Roman" w:cs="Times New Roman"/>
+          <w:b/>
+          <w:bCs/>
+          <w:kern w:val="0"/>
+          <w:sz w:val="36"/>
+          <w:szCs w:val="36"/>
+          <w14:ligatures w14:val="none"/>
+        </w:rPr>
+      </w:pPr>
+      <w:r>
+        <w:rPr>
+          <w:rFonts w:ascii="Times New Roman" w:eastAsia="Times New Roman" w:hAnsi="Times New Roman" w:cs="Times New Roman"/>
+          <w:b/>
+          <w:bCs/>
+          <w:kern w:val="0"/>
+          <w:sz w:val="36"/>
+          <w:szCs w:val="36"/>
+          <w14:ligatures w14:val="none"/>
+        </w:rPr>
+        <w:t xml:space="preserve">2. </w:t>
+      </w:r>
+      <w:r>
+        <w:rPr>
+          <w:rFonts w:ascii="Courier New" w:eastAsia="Times New Roman" w:hAnsi="Courier New" w:cs="Courier New"/>
+          <w:b/>
+          <w:bCs/>
+          <w:kern w:val="0"/>
+          <w:sz w:val="20"/>
+          <w:szCs w:val="20"/>
+          <w14:ligatures w14:val="none"/>
+        </w:rPr>
+        <w:t>" "</w:t>
+      </w:r>
+      <w:r>
+        <w:rPr>
+          <w:rFonts w:ascii="Times New Roman" w:eastAsia="Times New Roman" w:hAnsi="Times New Roman" w:cs="Times New Roman"/>
+          <w:b/>
+          <w:bCs/>
+          <w:kern w:val="0"/>
+          <w:sz w:val="36"/>
+          <w:szCs w:val="36"/>
+          <w14:ligatures w14:val="none"/>
+        </w:rPr>
+        <w:t xml:space="preserve"> </w:t>
+      </w:r>
+      <w:r>
+        <w:rPr>
+          <w:rFonts w:ascii="Heiti TC" w:eastAsia="Heiti TC" w:hAnsi="Heiti TC" w:cs="Heiti TC" w:hint="eastAsia"/>
+          <w:b/>
+          <w:bCs/>
+          <w:kern w:val="0"/>
+          <w:sz w:val="36"/>
+          <w:szCs w:val="36"/>
+          <w14:ligatures w14:val="none"/>
+        </w:rPr>
+        <w:t>和</w:t>
+      </w:r>
+      <w:r>
+        <w:rPr>
+          <w:rFonts w:ascii="Times New Roman" w:eastAsia="Times New Roman" w:hAnsi="Times New Roman" w:cs="Times New Roman"/>
+          <w:b/>
+          <w:bCs/>
+          <w:kern w:val="0"/>
+          <w:sz w:val="36"/>
+          <w:szCs w:val="36"/>
+          <w14:ligatures w14:val="none"/>
+        </w:rPr>
+        <w:t xml:space="preserve"> </w:t>
+      </w:r>
+      <w:r>
+        <w:rPr>
+          <w:rFonts w:ascii="Courier New" w:eastAsia="Times New Roman" w:hAnsi="Courier New" w:cs="Courier New"/>
+          <w:b/>
+          <w:bCs/>
+          <w:kern w:val="0"/>
+          <w:sz w:val="20"/>
+          <w:szCs w:val="20"/>
+          <w14:ligatures w14:val="none"/>
+        </w:rPr>
+        <w:t>NaN</w:t>
+      </w:r>
+      <w:r>
+        <w:rPr>
+          <w:rFonts w:ascii="Times New Roman" w:eastAsia="Times New Roman" w:hAnsi="Times New Roman" w:cs="Times New Roman"/>
+          <w:b/>
+          <w:bCs/>
+          <w:kern w:val="0"/>
+          <w:sz w:val="36"/>
+          <w:szCs w:val="36"/>
+          <w14:ligatures w14:val="none"/>
+        </w:rPr>
+        <w:t xml:space="preserve"> </w:t>
+      </w:r>
+      <w:r>
+        <w:rPr>
+          <w:rFonts w:ascii="Heiti TC" w:eastAsia="Heiti TC" w:hAnsi="Heiti TC" w:cs="Heiti TC" w:hint="eastAsia"/>
+          <w:b/>
+          <w:bCs/>
+          <w:kern w:val="0"/>
+          <w:sz w:val="36"/>
+          <w:szCs w:val="36"/>
+          <w14:ligatures w14:val="none"/>
+        </w:rPr>
+        <w:t>有什麼不同</w:t>
+      </w:r>
+      <w:r>
+        <w:rPr>
+          <w:rFonts w:ascii="Heiti TC" w:eastAsia="Heiti TC" w:hAnsi="Heiti TC" w:cs="Heiti TC"/>
+          <w:b/>
+          <w:bCs/>
+          <w:kern w:val="0"/>
+          <w:sz w:val="36"/>
+          <w:szCs w:val="36"/>
+          <w14:ligatures w14:val="none"/>
+        </w:rPr>
+        <w:t>？</w:t>
+      </w:r>
+    </w:p>
+    <w:p>
+      <w:pPr>
+        <w:spacing w:before="100" w:beforeAutospacing="1" w:after="100" w:afterAutospacing="1" w:line="240" w:lineRule="auto"/>
+        <w:rPr>
+          <w:rFonts w:ascii="Times New Roman" w:eastAsia="Times New Roman" w:hAnsi="Times New Roman" w:cs="Times New Roman"/>
+          <w:kern w:val="0"/>
+          <w14:ligatures w14:val="none"/>
+        </w:rPr>
+      </w:pPr>
+      <w:r>
+        <w:rPr>
+          <w:rFonts w:ascii="Heiti TC" w:eastAsia="Heiti TC" w:hAnsi="Heiti TC" w:cs="Heiti TC" w:hint="eastAsia"/>
+          <w:kern w:val="0"/>
+          <w14:ligatures w14:val="none"/>
+        </w:rPr>
+        <w:t>你答</w:t>
+      </w:r>
+      <w:r>
+        <w:rPr>
+          <w:rFonts w:ascii="Heiti TC" w:eastAsia="Heiti TC" w:hAnsi="Heiti TC" w:cs="Heiti TC"/>
+          <w:kern w:val="0"/>
+          <w14:ligatures w14:val="none"/>
+        </w:rPr>
+        <w:t>：</w:t>
+      </w:r>
+    </w:p>
+    <w:p>
+      <w:pPr>
+        <w:spacing w:before="100" w:beforeAutospacing="1" w:after="100" w:afterAutospacing="1" w:line="240" w:lineRule="auto"/>
+        <w:rPr>
+          <w:rFonts w:ascii="Times New Roman" w:eastAsia="Times New Roman" w:hAnsi="Times New Roman" w:cs="Times New Roman"/>
+          <w:kern w:val="0"/>
+          <w14:ligatures w14:val="none"/>
+        </w:rPr>
+      </w:pPr>
+      <w:r>
+        <w:rPr>
+          <w:rFonts w:ascii="Heiti TC" w:eastAsia="Heiti TC" w:hAnsi="Heiti TC" w:cs="Heiti TC" w:hint="eastAsia"/>
+          <w:kern w:val="0"/>
+          <w14:ligatures w14:val="none"/>
+        </w:rPr>
+        <w:t>一個是空值，</w:t>
+      </w:r>
+      <w:r>
+        <w:rPr>
+          <w:rFonts w:ascii="Times New Roman" w:eastAsia="Times New Roman" w:hAnsi="Times New Roman" w:cs="Times New Roman"/>
+          <w:kern w:val="0"/>
+          <w14:ligatures w14:val="none"/>
+        </w:rPr>
+        <w:t>NaN</w:t>
+      </w:r>
+      <w:r>
+        <w:rPr>
+          <w:rFonts w:ascii="Heiti TC" w:eastAsia="Heiti TC" w:hAnsi="Heiti TC" w:cs="Heiti TC" w:hint="eastAsia"/>
+          <w:kern w:val="0"/>
+          <w14:ligatures w14:val="none"/>
+        </w:rPr>
+        <w:t>可以當數</w:t>
+      </w:r>
+      <w:r>
+        <w:rPr>
+          <w:rFonts w:ascii="Heiti TC" w:eastAsia="Heiti TC" w:hAnsi="Heiti TC" w:cs="Heiti TC"/>
+          <w:kern w:val="0"/>
+          <w14:ligatures w14:val="none"/>
+        </w:rPr>
+        <w:t>值</w:t>
+      </w:r>
+    </w:p>
+    <w:p>
+      <w:pPr>
+        <w:spacing w:before="100" w:beforeAutospacing="1" w:after="100" w:afterAutospacing="1" w:line="240" w:lineRule="auto"/>
+        <w:rPr>
+          <w:rFonts w:ascii="Times New Roman" w:eastAsia="Times New Roman" w:hAnsi="Times New Roman" w:cs="Times New Roman"/>
+          <w:kern w:val="0"/>
+          <w14:ligatures w14:val="none"/>
+        </w:rPr>
+      </w:pPr>
+      <w:r>
+        <w:rPr>
+          <w:rFonts w:ascii="Heiti TC" w:eastAsia="Heiti TC" w:hAnsi="Heiti TC" w:cs="Heiti TC" w:hint="eastAsia"/>
+          <w:kern w:val="0"/>
+          <w14:ligatures w14:val="none"/>
+        </w:rPr>
+        <w:t>你有抓到一半，但這裡要修正一下</w:t>
+      </w:r>
+      <w:r>
+        <w:rPr>
+          <w:rFonts w:ascii="Heiti TC" w:eastAsia="Heiti TC" w:hAnsi="Heiti TC" w:cs="Heiti TC"/>
+          <w:kern w:val="0"/>
+          <w14:ligatures w14:val="none"/>
+        </w:rPr>
+        <w:t>：</w:t>
+      </w:r>
+    </w:p>
+    <w:p>
+      <w:pPr>
+        <w:spacing w:before="100" w:beforeAutospacing="1" w:after="100" w:afterAutospacing="1" w:line="240" w:lineRule="auto"/>
+        <w:outlineLvl w:val="2"/>
+        <w:rPr>
+          <w:rFonts w:ascii="Times New Roman" w:eastAsia="Times New Roman" w:hAnsi="Times New Roman" w:cs="Times New Roman"/>
+          <w:b/>
+          <w:bCs/>
+          <w:kern w:val="0"/>
+          <w:sz w:val="27"/>
+          <w:szCs w:val="27"/>
+          <w14:ligatures w14:val="none"/>
+        </w:rPr>
+      </w:pPr>
+      <w:r>
+        <w:rPr>
+          <w:rFonts w:ascii="Heiti TC" w:eastAsia="Heiti TC" w:hAnsi="Heiti TC" w:cs="Heiti TC" w:hint="eastAsia"/>
+          <w:b/>
+          <w:bCs/>
+          <w:kern w:val="0"/>
+          <w:sz w:val="27"/>
+          <w:szCs w:val="27"/>
+          <w14:ligatures w14:val="none"/>
+        </w:rPr>
+        <w:lastRenderedPageBreak/>
+        <w:t>正確概</w:t>
+      </w:r>
+      <w:r>
+        <w:rPr>
+          <w:rFonts w:ascii="Heiti TC" w:eastAsia="Heiti TC" w:hAnsi="Heiti TC" w:cs="Heiti TC"/>
+          <w:b/>
+          <w:bCs/>
+          <w:kern w:val="0"/>
+          <w:sz w:val="27"/>
+          <w:szCs w:val="27"/>
+          <w14:ligatures w14:val="none"/>
+        </w:rPr>
+        <w:t>念</w:t>
+      </w:r>
+    </w:p>
+    <w:p>
+      <w:pPr>
+        <w:numPr>
+          <w:ilvl w:val="0"/>
+          <w:numId w:val="6"/>
+        </w:numPr>
+        <w:spacing w:before="100" w:beforeAutospacing="1" w:after="100" w:afterAutospacing="1" w:line="240" w:lineRule="auto"/>
+        <w:rPr>
+          <w:rFonts w:ascii="Times New Roman" w:eastAsia="Times New Roman" w:hAnsi="Times New Roman" w:cs="Times New Roman"/>
+          <w:kern w:val="0"/>
+          <w14:ligatures w14:val="none"/>
+        </w:rPr>
+      </w:pPr>
+      <w:r>
+        <w:rPr>
+          <w:rFonts w:ascii="Courier New" w:eastAsia="Times New Roman" w:hAnsi="Courier New" w:cs="Courier New"/>
+          <w:kern w:val="0"/>
+          <w:sz w:val="20"/>
+          <w:szCs w:val="20"/>
+          <w14:ligatures w14:val="none"/>
+        </w:rPr>
+        <w:t>" "</w:t>
+      </w:r>
+      <w:r>
+        <w:rPr>
+          <w:rFonts w:ascii="Times New Roman" w:eastAsia="Times New Roman" w:hAnsi="Times New Roman" w:cs="Times New Roman"/>
+          <w:kern w:val="0"/>
+          <w14:ligatures w14:val="none"/>
+        </w:rPr>
+        <w:t xml:space="preserve"> </w:t>
+      </w:r>
+      <w:r>
+        <w:rPr>
+          <w:rFonts w:ascii="Heiti TC" w:eastAsia="Heiti TC" w:hAnsi="Heiti TC" w:cs="Heiti TC" w:hint="eastAsia"/>
+          <w:kern w:val="0"/>
+          <w14:ligatures w14:val="none"/>
+        </w:rPr>
+        <w:t>是</w:t>
+      </w:r>
+      <w:r>
+        <w:rPr>
+          <w:rFonts w:ascii="Heiti TC" w:eastAsia="Heiti TC" w:hAnsi="Heiti TC" w:cs="Heiti TC" w:hint="eastAsia"/>
+          <w:b/>
+          <w:bCs/>
+          <w:kern w:val="0"/>
+          <w14:ligatures w14:val="none"/>
+        </w:rPr>
+        <w:t>字串</w:t>
+      </w:r>
+      <w:r>
+        <w:rPr>
+          <w:rFonts w:ascii="Heiti TC" w:eastAsia="Heiti TC" w:hAnsi="Heiti TC" w:cs="Heiti TC" w:hint="eastAsia"/>
+          <w:kern w:val="0"/>
+          <w14:ligatures w14:val="none"/>
+        </w:rPr>
+        <w:t>，只是內容剛好是空白</w:t>
+      </w:r>
+      <w:r>
+        <w:rPr>
+          <w:rFonts w:ascii="Times New Roman" w:eastAsia="Times New Roman" w:hAnsi="Times New Roman" w:cs="Times New Roman"/>
+          <w:kern w:val="0"/>
+          <w14:ligatures w14:val="none"/>
+        </w:rPr>
+        <w:t xml:space="preserve"> </w:t>
+      </w:r>
+    </w:p>
+    <w:p>
+      <w:pPr>
+        <w:numPr>
+          <w:ilvl w:val="0"/>
+          <w:numId w:val="6"/>
+        </w:numPr>
+        <w:spacing w:before="100" w:beforeAutospacing="1" w:after="100" w:afterAutospacing="1" w:line="240" w:lineRule="auto"/>
+        <w:rPr>
+          <w:rFonts w:ascii="Times New Roman" w:eastAsia="Times New Roman" w:hAnsi="Times New Roman" w:cs="Times New Roman"/>
+          <w:kern w:val="0"/>
+          <w14:ligatures w14:val="none"/>
+        </w:rPr>
+      </w:pPr>
+      <w:r>
+        <w:rPr>
+          <w:rFonts w:ascii="Courier New" w:eastAsia="Times New Roman" w:hAnsi="Courier New" w:cs="Courier New"/>
+          <w:kern w:val="0"/>
+          <w:sz w:val="20"/>
+          <w:szCs w:val="20"/>
+          <w14:ligatures w14:val="none"/>
+        </w:rPr>
+        <w:t>NaN</w:t>
+      </w:r>
+      <w:r>
+        <w:rPr>
+          <w:rFonts w:ascii="Times New Roman" w:eastAsia="Times New Roman" w:hAnsi="Times New Roman" w:cs="Times New Roman"/>
+          <w:kern w:val="0"/>
+          <w14:ligatures w14:val="none"/>
+        </w:rPr>
+        <w:t xml:space="preserve"> </w:t>
+      </w:r>
+      <w:r>
+        <w:rPr>
+          <w:rFonts w:ascii="Heiti TC" w:eastAsia="Heiti TC" w:hAnsi="Heiti TC" w:cs="Heiti TC" w:hint="eastAsia"/>
+          <w:kern w:val="0"/>
+          <w14:ligatures w14:val="none"/>
+        </w:rPr>
+        <w:t>是</w:t>
+      </w:r>
+      <w:r>
+        <w:rPr>
+          <w:rFonts w:ascii="Heiti TC" w:eastAsia="Heiti TC" w:hAnsi="Heiti TC" w:cs="Heiti TC" w:hint="eastAsia"/>
+          <w:b/>
+          <w:bCs/>
+          <w:kern w:val="0"/>
+          <w14:ligatures w14:val="none"/>
+        </w:rPr>
+        <w:t>缺失值標記</w:t>
+      </w:r>
+      <w:r>
+        <w:rPr>
+          <w:rFonts w:ascii="Heiti TC" w:eastAsia="Heiti TC" w:hAnsi="Heiti TC" w:cs="Heiti TC" w:hint="eastAsia"/>
+          <w:kern w:val="0"/>
+          <w14:ligatures w14:val="none"/>
+        </w:rPr>
+        <w:t>，代表資料缺漏</w:t>
+      </w:r>
+      <w:r>
+        <w:rPr>
+          <w:rFonts w:ascii="Times New Roman" w:eastAsia="Times New Roman" w:hAnsi="Times New Roman" w:cs="Times New Roman"/>
+          <w:kern w:val="0"/>
+          <w14:ligatures w14:val="none"/>
+        </w:rPr>
+        <w:t xml:space="preserve"> </w:t>
+      </w:r>
+    </w:p>
+    <w:p>
+      <w:pPr>
+        <w:spacing w:before="100" w:beforeAutospacing="1" w:after="100" w:afterAutospacing="1" w:line="240" w:lineRule="auto"/>
+        <w:outlineLvl w:val="2"/>
+        <w:rPr>
+          <w:rFonts w:ascii="Times New Roman" w:eastAsia="Times New Roman" w:hAnsi="Times New Roman" w:cs="Times New Roman"/>
+          <w:b/>
+          <w:bCs/>
+          <w:kern w:val="0"/>
+          <w:sz w:val="27"/>
+          <w:szCs w:val="27"/>
+          <w14:ligatures w14:val="none"/>
+        </w:rPr>
+      </w:pPr>
+      <w:r>
+        <w:rPr>
+          <w:rFonts w:ascii="Heiti TC" w:eastAsia="Heiti TC" w:hAnsi="Heiti TC" w:cs="Heiti TC" w:hint="eastAsia"/>
+          <w:b/>
+          <w:bCs/>
+          <w:kern w:val="0"/>
+          <w:sz w:val="27"/>
+          <w:szCs w:val="27"/>
+          <w14:ligatures w14:val="none"/>
+        </w:rPr>
+        <w:t>很重要的一</w:t>
+      </w:r>
+      <w:r>
+        <w:rPr>
+          <w:rFonts w:ascii="Heiti TC" w:eastAsia="Heiti TC" w:hAnsi="Heiti TC" w:cs="Heiti TC"/>
+          <w:b/>
+          <w:bCs/>
+          <w:kern w:val="0"/>
+          <w:sz w:val="27"/>
+          <w:szCs w:val="27"/>
+          <w14:ligatures w14:val="none"/>
+        </w:rPr>
+        <w:t>點</w:t>
+      </w:r>
+    </w:p>
+    <w:p>
+      <w:pPr>
+        <w:spacing w:before="100" w:beforeAutospacing="1" w:after="100" w:afterAutospacing="1" w:line="240" w:lineRule="auto"/>
+        <w:rPr>
+          <w:rFonts w:ascii="Times New Roman" w:eastAsia="Times New Roman" w:hAnsi="Times New Roman" w:cs="Times New Roman"/>
+          <w:kern w:val="0"/>
+          <w14:ligatures w14:val="none"/>
+        </w:rPr>
+      </w:pPr>
+      <w:r>
+        <w:rPr>
+          <w:rFonts w:ascii="Courier New" w:eastAsia="Times New Roman" w:hAnsi="Courier New" w:cs="Courier New"/>
+          <w:b/>
+          <w:bCs/>
+          <w:kern w:val="0"/>
+          <w:sz w:val="20"/>
+          <w:szCs w:val="20"/>
+          <w14:ligatures w14:val="none"/>
+        </w:rPr>
+        <w:t>NaN</w:t>
+      </w:r>
+      <w:r>
+        <w:rPr>
+          <w:rFonts w:ascii="Times New Roman" w:eastAsia="Times New Roman" w:hAnsi="Times New Roman" w:cs="Times New Roman"/>
+          <w:b/>
+          <w:bCs/>
+          <w:kern w:val="0"/>
+          <w14:ligatures w14:val="none"/>
+        </w:rPr>
+        <w:t xml:space="preserve"> </w:t>
+      </w:r>
+      <w:r>
+        <w:rPr>
+          <w:rFonts w:ascii="Heiti TC" w:eastAsia="Heiti TC" w:hAnsi="Heiti TC" w:cs="Heiti TC" w:hint="eastAsia"/>
+          <w:b/>
+          <w:bCs/>
+          <w:kern w:val="0"/>
+          <w14:ligatures w14:val="none"/>
+        </w:rPr>
+        <w:t>不是正常數值</w:t>
+      </w:r>
+      <w:r>
+        <w:rPr>
+          <w:rFonts w:ascii="Heiti TC" w:eastAsia="Heiti TC" w:hAnsi="Heiti TC" w:cs="Heiti TC" w:hint="eastAsia"/>
+          <w:kern w:val="0"/>
+          <w14:ligatures w14:val="none"/>
+        </w:rPr>
+        <w:t>，它不是一個真的數字拿來做一般計算。</w:t>
+      </w:r>
+      <w:r>
+        <w:rPr>
+          <w:rFonts w:ascii="Times New Roman" w:eastAsia="Times New Roman" w:hAnsi="Times New Roman" w:cs="Times New Roman"/>
+          <w:kern w:val="0"/>
+          <w14:ligatures w14:val="none"/>
+        </w:rPr>
+        <w:br/>
+      </w:r>
+      <w:r>
+        <w:rPr>
+          <w:rFonts w:ascii="Heiti TC" w:eastAsia="Heiti TC" w:hAnsi="Heiti TC" w:cs="Heiti TC" w:hint="eastAsia"/>
+          <w:kern w:val="0"/>
+          <w14:ligatures w14:val="none"/>
+        </w:rPr>
+        <w:t>它是</w:t>
+      </w:r>
+      <w:r>
+        <w:rPr>
+          <w:rFonts w:ascii="Times New Roman" w:eastAsia="Times New Roman" w:hAnsi="Times New Roman" w:cs="Times New Roman"/>
+          <w:kern w:val="0"/>
+          <w14:ligatures w14:val="none"/>
+        </w:rPr>
+        <w:t xml:space="preserve"> pandas / NumPy </w:t>
+      </w:r>
+      <w:r>
+        <w:rPr>
+          <w:rFonts w:ascii="Heiti TC" w:eastAsia="Heiti TC" w:hAnsi="Heiti TC" w:cs="Heiti TC" w:hint="eastAsia"/>
+          <w:kern w:val="0"/>
+          <w14:ligatures w14:val="none"/>
+        </w:rPr>
+        <w:t>用來表示「這裡沒有資料」的特殊值</w:t>
+      </w:r>
+      <w:r>
+        <w:rPr>
+          <w:rFonts w:ascii="Heiti TC" w:eastAsia="Heiti TC" w:hAnsi="Heiti TC" w:cs="Heiti TC"/>
+          <w:kern w:val="0"/>
+          <w14:ligatures w14:val="none"/>
+        </w:rPr>
+        <w:t>。</w:t>
+      </w:r>
+    </w:p>
+    <w:p>
+      <w:pPr>
+        <w:spacing w:before="100" w:beforeAutospacing="1" w:after="100" w:afterAutospacing="1" w:line="240" w:lineRule="auto"/>
+        <w:rPr>
+          <w:rFonts w:ascii="Times New Roman" w:eastAsia="Times New Roman" w:hAnsi="Times New Roman" w:cs="Times New Roman"/>
+          <w:kern w:val="0"/>
+          <w14:ligatures w14:val="none"/>
+        </w:rPr>
+      </w:pPr>
+      <w:r>
+        <w:rPr>
+          <w:rFonts w:ascii="Heiti TC" w:eastAsia="Heiti TC" w:hAnsi="Heiti TC" w:cs="Heiti TC" w:hint="eastAsia"/>
+          <w:b/>
+          <w:bCs/>
+          <w:kern w:val="0"/>
+          <w14:ligatures w14:val="none"/>
+        </w:rPr>
+        <w:t>更好版本：</w:t>
+      </w:r>
+      <w:r>
+        <w:rPr>
+          <w:rFonts w:ascii="Times New Roman" w:eastAsia="Times New Roman" w:hAnsi="Times New Roman" w:cs="Times New Roman"/>
+          <w:kern w:val="0"/>
+          <w14:ligatures w14:val="none"/>
+        </w:rPr>
+        <w:br/>
+        <w:t xml:space="preserve">A blank string </w:t>
+      </w:r>
+      <w:r>
+        <w:rPr>
+          <w:rFonts w:ascii="Courier New" w:eastAsia="Times New Roman" w:hAnsi="Courier New" w:cs="Courier New"/>
+          <w:kern w:val="0"/>
+          <w:sz w:val="20"/>
+          <w:szCs w:val="20"/>
+          <w14:ligatures w14:val="none"/>
+        </w:rPr>
+        <w:t>" "</w:t>
+      </w:r>
+      <w:r>
+        <w:rPr>
+          <w:rFonts w:ascii="Times New Roman" w:eastAsia="Times New Roman" w:hAnsi="Times New Roman" w:cs="Times New Roman"/>
+          <w:kern w:val="0"/>
+          <w14:ligatures w14:val="none"/>
+        </w:rPr>
+        <w:t xml:space="preserve"> is a text value, while </w:t>
+      </w:r>
+      <w:r>
+        <w:rPr>
+          <w:rFonts w:ascii="Courier New" w:eastAsia="Times New Roman" w:hAnsi="Courier New" w:cs="Courier New"/>
+          <w:kern w:val="0"/>
+          <w:sz w:val="20"/>
+          <w:szCs w:val="20"/>
+          <w14:ligatures w14:val="none"/>
+        </w:rPr>
+        <w:t>NaN</w:t>
+      </w:r>
+      <w:r>
+        <w:rPr>
+          <w:rFonts w:ascii="Times New Roman" w:eastAsia="Times New Roman" w:hAnsi="Times New Roman" w:cs="Times New Roman"/>
+          <w:kern w:val="0"/>
+          <w14:ligatures w14:val="none"/>
+        </w:rPr>
+        <w:t xml:space="preserve"> represents a missing value in the dataset. They are not the same, and pandas does not automatically treat </w:t>
+      </w:r>
+      <w:r>
+        <w:rPr>
+          <w:rFonts w:ascii="Courier New" w:eastAsia="Times New Roman" w:hAnsi="Courier New" w:cs="Courier New"/>
+          <w:kern w:val="0"/>
+          <w:sz w:val="20"/>
+          <w:szCs w:val="20"/>
+          <w14:ligatures w14:val="none"/>
+        </w:rPr>
+        <w:t>" "</w:t>
+      </w:r>
+      <w:r>
+        <w:rPr>
+          <w:rFonts w:ascii="Times New Roman" w:eastAsia="Times New Roman" w:hAnsi="Times New Roman" w:cs="Times New Roman"/>
+          <w:kern w:val="0"/>
+          <w14:ligatures w14:val="none"/>
+        </w:rPr>
+        <w:t xml:space="preserve"> as missing unless we convert it.</w:t>
+      </w:r>
+    </w:p>
+    <w:p>
+      <w:pPr>
+        <w:spacing w:before="100" w:beforeAutospacing="1" w:after="100" w:afterAutospacing="1" w:line="240" w:lineRule="auto"/>
+        <w:rPr>
+          <w:rFonts w:ascii="Times New Roman" w:eastAsia="Times New Roman" w:hAnsi="Times New Roman" w:cs="Times New Roman"/>
+          <w:kern w:val="0"/>
+          <w14:ligatures w14:val="none"/>
+        </w:rPr>
+      </w:pPr>
+      <w:r>
+        <w:rPr>
+          <w:rFonts w:ascii="Heiti TC" w:eastAsia="Heiti TC" w:hAnsi="Heiti TC" w:cs="Heiti TC" w:hint="eastAsia"/>
+          <w:b/>
+          <w:bCs/>
+          <w:kern w:val="0"/>
+          <w14:ligatures w14:val="none"/>
+        </w:rPr>
+        <w:t>中文理解：</w:t>
+      </w:r>
+      <w:r>
+        <w:rPr>
+          <w:rFonts w:ascii="Times New Roman" w:eastAsia="Times New Roman" w:hAnsi="Times New Roman" w:cs="Times New Roman"/>
+          <w:kern w:val="0"/>
+          <w14:ligatures w14:val="none"/>
+        </w:rPr>
+        <w:br/>
+      </w:r>
+      <w:r>
+        <w:rPr>
+          <w:rFonts w:ascii="Courier New" w:eastAsia="Times New Roman" w:hAnsi="Courier New" w:cs="Courier New"/>
+          <w:kern w:val="0"/>
+          <w:sz w:val="20"/>
+          <w:szCs w:val="20"/>
+          <w14:ligatures w14:val="none"/>
+        </w:rPr>
+        <w:t>" "</w:t>
+      </w:r>
+      <w:r>
+        <w:rPr>
+          <w:rFonts w:ascii="Times New Roman" w:eastAsia="Times New Roman" w:hAnsi="Times New Roman" w:cs="Times New Roman"/>
+          <w:kern w:val="0"/>
+          <w14:ligatures w14:val="none"/>
+        </w:rPr>
+        <w:t xml:space="preserve"> </w:t>
+      </w:r>
+      <w:r>
+        <w:rPr>
+          <w:rFonts w:ascii="Heiti TC" w:eastAsia="Heiti TC" w:hAnsi="Heiti TC" w:cs="Heiti TC" w:hint="eastAsia"/>
+          <w:kern w:val="0"/>
+          <w14:ligatures w14:val="none"/>
+        </w:rPr>
+        <w:t>是文字，</w:t>
+      </w:r>
+      <w:r>
+        <w:rPr>
+          <w:rFonts w:ascii="Courier New" w:eastAsia="Times New Roman" w:hAnsi="Courier New" w:cs="Courier New"/>
+          <w:kern w:val="0"/>
+          <w:sz w:val="20"/>
+          <w:szCs w:val="20"/>
+          <w14:ligatures w14:val="none"/>
+        </w:rPr>
+        <w:t>NaN</w:t>
+      </w:r>
+      <w:r>
+        <w:rPr>
+          <w:rFonts w:ascii="Times New Roman" w:eastAsia="Times New Roman" w:hAnsi="Times New Roman" w:cs="Times New Roman"/>
+          <w:kern w:val="0"/>
+          <w14:ligatures w14:val="none"/>
+        </w:rPr>
+        <w:t xml:space="preserve"> </w:t>
+      </w:r>
+      <w:r>
+        <w:rPr>
+          <w:rFonts w:ascii="Heiti TC" w:eastAsia="Heiti TC" w:hAnsi="Heiti TC" w:cs="Heiti TC" w:hint="eastAsia"/>
+          <w:kern w:val="0"/>
+          <w14:ligatures w14:val="none"/>
+        </w:rPr>
+        <w:t>才是真正的缺失值。</w:t>
+      </w:r>
+      <w:r>
+        <w:rPr>
+          <w:rFonts w:ascii="Times New Roman" w:eastAsia="Times New Roman" w:hAnsi="Times New Roman" w:cs="Times New Roman"/>
+          <w:kern w:val="0"/>
+          <w14:ligatures w14:val="none"/>
+        </w:rPr>
+        <w:br/>
+      </w:r>
+      <w:r>
+        <w:rPr>
+          <w:rFonts w:ascii="Heiti TC" w:eastAsia="Heiti TC" w:hAnsi="Heiti TC" w:cs="Heiti TC" w:hint="eastAsia"/>
+          <w:kern w:val="0"/>
+          <w14:ligatures w14:val="none"/>
+        </w:rPr>
+        <w:t>所以如果資料裡是</w:t>
+      </w:r>
+      <w:r>
+        <w:rPr>
+          <w:rFonts w:ascii="Times New Roman" w:eastAsia="Times New Roman" w:hAnsi="Times New Roman" w:cs="Times New Roman"/>
+          <w:kern w:val="0"/>
+          <w14:ligatures w14:val="none"/>
+        </w:rPr>
+        <w:t xml:space="preserve"> </w:t>
+      </w:r>
+      <w:r>
+        <w:rPr>
+          <w:rFonts w:ascii="Courier New" w:eastAsia="Times New Roman" w:hAnsi="Courier New" w:cs="Courier New"/>
+          <w:kern w:val="0"/>
+          <w:sz w:val="20"/>
+          <w:szCs w:val="20"/>
+          <w14:ligatures w14:val="none"/>
+        </w:rPr>
+        <w:t>" "</w:t>
+      </w:r>
+      <w:r>
+        <w:rPr>
+          <w:rFonts w:ascii="Heiti TC" w:eastAsia="Heiti TC" w:hAnsi="Heiti TC" w:cs="Heiti TC" w:hint="eastAsia"/>
+          <w:kern w:val="0"/>
+          <w14:ligatures w14:val="none"/>
+        </w:rPr>
+        <w:t>，</w:t>
+      </w:r>
+      <w:r>
+        <w:rPr>
+          <w:rFonts w:ascii="Times New Roman" w:eastAsia="Times New Roman" w:hAnsi="Times New Roman" w:cs="Times New Roman"/>
+          <w:kern w:val="0"/>
+          <w14:ligatures w14:val="none"/>
+        </w:rPr>
+        <w:t xml:space="preserve">pandas </w:t>
+      </w:r>
+      <w:r>
+        <w:rPr>
+          <w:rFonts w:ascii="Heiti TC" w:eastAsia="Heiti TC" w:hAnsi="Heiti TC" w:cs="Heiti TC" w:hint="eastAsia"/>
+          <w:kern w:val="0"/>
+          <w14:ligatures w14:val="none"/>
+        </w:rPr>
+        <w:t>不一定會自動把它當作缺值</w:t>
+      </w:r>
+      <w:r>
+        <w:rPr>
+          <w:rFonts w:ascii="Heiti TC" w:eastAsia="Heiti TC" w:hAnsi="Heiti TC" w:cs="Heiti TC"/>
+          <w:kern w:val="0"/>
+          <w14:ligatures w14:val="none"/>
+        </w:rPr>
+        <w:t>。</w:t>
+      </w:r>
+    </w:p>
+    <w:p>
+      <w:pPr>
+        <w:spacing w:after="0" w:line="240" w:lineRule="auto"/>
+        <w:rPr>
+          <w:rFonts w:ascii="Times New Roman" w:eastAsia="Times New Roman" w:hAnsi="Times New Roman" w:cs="Times New Roman"/>
+          <w:kern w:val="0"/>
+          <w14:ligatures w14:val="none"/>
+        </w:rPr>
+      </w:pPr>
+      <w:r>
+        <w:rPr>
+          <w:rFonts w:ascii="Times New Roman" w:eastAsia="Times New Roman" w:hAnsi="Times New Roman" w:cs="Times New Roman"/>
+          <w:noProof/>
+          <w:kern w:val="0"/>
+        </w:rPr>
+        <w:pict w14:anchorId="459C04A6">
+          <v:rect id="_x0000_i1026" alt="" style="width:451.3pt;height:.05pt;mso-width-percent:0;mso-height-percent:0;mso-width-percent:0;mso-height-percent:0" o:hralign="center" o:hrstd="t" o:hr="t" fillcolor="#a0a0a0" stroked="f"/>
+        </w:pict>
+      </w:r>
+    </w:p>
+    <w:p>
+      <w:pPr>
+        <w:spacing w:before="100" w:beforeAutospacing="1" w:after="100" w:afterAutospacing="1" w:line="240" w:lineRule="auto"/>
+        <w:outlineLvl w:val="1"/>
+        <w:rPr>
+          <w:rFonts w:ascii="Times New Roman" w:eastAsia="Times New Roman" w:hAnsi="Times New Roman" w:cs="Times New Roman"/>
+          <w:b/>
+          <w:bCs/>
+          <w:kern w:val="0"/>
+          <w:sz w:val="36"/>
+          <w:szCs w:val="36"/>
+          <w14:ligatures w14:val="none"/>
+        </w:rPr>
+      </w:pPr>
+      <w:r>
+        <w:rPr>
+          <w:rFonts w:ascii="Times New Roman" w:eastAsia="Times New Roman" w:hAnsi="Times New Roman" w:cs="Times New Roman"/>
+          <w:b/>
+          <w:bCs/>
+          <w:kern w:val="0"/>
+          <w:sz w:val="36"/>
+          <w:szCs w:val="36"/>
+          <w14:ligatures w14:val="none"/>
+        </w:rPr>
+        <w:t xml:space="preserve">3. </w:t>
+      </w:r>
+      <w:r>
+        <w:rPr>
+          <w:rFonts w:ascii="Heiti TC" w:eastAsia="Heiti TC" w:hAnsi="Heiti TC" w:cs="Heiti TC" w:hint="eastAsia"/>
+          <w:b/>
+          <w:bCs/>
+          <w:kern w:val="0"/>
+          <w:sz w:val="36"/>
+          <w:szCs w:val="36"/>
+          <w14:ligatures w14:val="none"/>
+        </w:rPr>
+        <w:t>你今天最後是怎麼處理</w:t>
+      </w:r>
+      <w:r>
+        <w:rPr>
+          <w:rFonts w:ascii="Times New Roman" w:eastAsia="Times New Roman" w:hAnsi="Times New Roman" w:cs="Times New Roman"/>
+          <w:b/>
+          <w:bCs/>
+          <w:kern w:val="0"/>
+          <w:sz w:val="36"/>
+          <w:szCs w:val="36"/>
+          <w14:ligatures w14:val="none"/>
+        </w:rPr>
+        <w:t xml:space="preserve"> </w:t>
+      </w:r>
+      <w:r>
+        <w:rPr>
+          <w:rFonts w:ascii="Courier New" w:eastAsia="Times New Roman" w:hAnsi="Courier New" w:cs="Courier New"/>
+          <w:b/>
+          <w:bCs/>
+          <w:kern w:val="0"/>
+          <w:sz w:val="20"/>
+          <w:szCs w:val="20"/>
+          <w14:ligatures w14:val="none"/>
+        </w:rPr>
+        <w:t>TotalCharges</w:t>
+      </w:r>
+      <w:r>
+        <w:rPr>
+          <w:rFonts w:ascii="Times New Roman" w:eastAsia="Times New Roman" w:hAnsi="Times New Roman" w:cs="Times New Roman"/>
+          <w:b/>
+          <w:bCs/>
+          <w:kern w:val="0"/>
+          <w:sz w:val="36"/>
+          <w:szCs w:val="36"/>
+          <w14:ligatures w14:val="none"/>
+        </w:rPr>
+        <w:t xml:space="preserve"> </w:t>
+      </w:r>
+      <w:r>
+        <w:rPr>
+          <w:rFonts w:ascii="Heiti TC" w:eastAsia="Heiti TC" w:hAnsi="Heiti TC" w:cs="Heiti TC" w:hint="eastAsia"/>
+          <w:b/>
+          <w:bCs/>
+          <w:kern w:val="0"/>
+          <w:sz w:val="36"/>
+          <w:szCs w:val="36"/>
+          <w14:ligatures w14:val="none"/>
+        </w:rPr>
+        <w:t>缺失值的</w:t>
+      </w:r>
+      <w:r>
+        <w:rPr>
+          <w:rFonts w:ascii="Heiti TC" w:eastAsia="Heiti TC" w:hAnsi="Heiti TC" w:cs="Heiti TC"/>
+          <w:b/>
+          <w:bCs/>
+          <w:kern w:val="0"/>
+          <w:sz w:val="36"/>
+          <w:szCs w:val="36"/>
+          <w14:ligatures w14:val="none"/>
+        </w:rPr>
+        <w:t>？</w:t>
+      </w:r>
+    </w:p>
+    <w:p>
+      <w:pPr>
+        <w:spacing w:before="100" w:beforeAutospacing="1" w:after="100" w:afterAutospacing="1" w:line="240" w:lineRule="auto"/>
+        <w:rPr>
+          <w:rFonts w:ascii="Times New Roman" w:eastAsia="Times New Roman" w:hAnsi="Times New Roman" w:cs="Times New Roman"/>
+          <w:kern w:val="0"/>
+          <w14:ligatures w14:val="none"/>
+        </w:rPr>
+      </w:pPr>
+      <w:r>
+        <w:rPr>
+          <w:rFonts w:ascii="Heiti TC" w:eastAsia="Heiti TC" w:hAnsi="Heiti TC" w:cs="Heiti TC" w:hint="eastAsia"/>
+          <w:kern w:val="0"/>
+          <w14:ligatures w14:val="none"/>
+        </w:rPr>
+        <w:t>你答</w:t>
+      </w:r>
+      <w:r>
+        <w:rPr>
+          <w:rFonts w:ascii="Heiti TC" w:eastAsia="Heiti TC" w:hAnsi="Heiti TC" w:cs="Heiti TC"/>
+          <w:kern w:val="0"/>
+          <w14:ligatures w14:val="none"/>
+        </w:rPr>
+        <w:t>：</w:t>
+      </w:r>
+    </w:p>
+    <w:p>
+      <w:pPr>
+        <w:spacing w:before="100" w:beforeAutospacing="1" w:after="100" w:afterAutospacing="1" w:line="240" w:lineRule="auto"/>
+        <w:rPr>
+          <w:rFonts w:ascii="Times New Roman" w:eastAsia="Times New Roman" w:hAnsi="Times New Roman" w:cs="Times New Roman"/>
+          <w:kern w:val="0"/>
+          <w14:ligatures w14:val="none"/>
+        </w:rPr>
+      </w:pPr>
+      <w:r>
+        <w:rPr>
+          <w:rFonts w:ascii="Heiti TC" w:eastAsia="Heiti TC" w:hAnsi="Heiti TC" w:cs="Heiti TC" w:hint="eastAsia"/>
+          <w:kern w:val="0"/>
+          <w14:ligatures w14:val="none"/>
+        </w:rPr>
+        <w:t>刪除，同意你的看法，最主要是新顧客，另一方面是佔總體比數很</w:t>
+      </w:r>
+      <w:r>
+        <w:rPr>
+          <w:rFonts w:ascii="Heiti TC" w:eastAsia="Heiti TC" w:hAnsi="Heiti TC" w:cs="Heiti TC"/>
+          <w:kern w:val="0"/>
+          <w14:ligatures w14:val="none"/>
+        </w:rPr>
+        <w:t>小</w:t>
+      </w:r>
+    </w:p>
+    <w:p>
+      <w:pPr>
+        <w:spacing w:before="100" w:beforeAutospacing="1" w:after="100" w:afterAutospacing="1" w:line="240" w:lineRule="auto"/>
+        <w:rPr>
+          <w:rFonts w:ascii="Times New Roman" w:eastAsia="Times New Roman" w:hAnsi="Times New Roman" w:cs="Times New Roman"/>
+          <w:kern w:val="0"/>
+          <w14:ligatures w14:val="none"/>
+        </w:rPr>
+      </w:pPr>
+      <w:r>
+        <w:rPr>
+          <w:rFonts w:ascii="Heiti TC" w:eastAsia="Heiti TC" w:hAnsi="Heiti TC" w:cs="Heiti TC" w:hint="eastAsia"/>
+          <w:kern w:val="0"/>
+          <w14:ligatures w14:val="none"/>
+        </w:rPr>
+        <w:t>這個答得很好，邏輯是對的</w:t>
+      </w:r>
+      <w:r>
+        <w:rPr>
+          <w:rFonts w:ascii="Heiti TC" w:eastAsia="Heiti TC" w:hAnsi="Heiti TC" w:cs="Heiti TC"/>
+          <w:kern w:val="0"/>
+          <w14:ligatures w14:val="none"/>
+        </w:rPr>
+        <w:t>。</w:t>
+      </w:r>
+    </w:p>
+    <w:p>
+      <w:pPr>
+        <w:spacing w:before="100" w:beforeAutospacing="1" w:after="100" w:afterAutospacing="1" w:line="240" w:lineRule="auto"/>
+        <w:rPr>
+          <w:rFonts w:ascii="Times New Roman" w:eastAsia="Times New Roman" w:hAnsi="Times New Roman" w:cs="Times New Roman"/>
+          <w:kern w:val="0"/>
+          <w14:ligatures w14:val="none"/>
+        </w:rPr>
+      </w:pPr>
+      <w:r>
+        <w:rPr>
+          <w:rFonts w:ascii="Heiti TC" w:eastAsia="Heiti TC" w:hAnsi="Heiti TC" w:cs="Heiti TC" w:hint="eastAsia"/>
+          <w:b/>
+          <w:bCs/>
+          <w:kern w:val="0"/>
+          <w14:ligatures w14:val="none"/>
+        </w:rPr>
+        <w:t>更好版本：</w:t>
+      </w:r>
+      <w:r>
+        <w:rPr>
+          <w:rFonts w:ascii="Times New Roman" w:eastAsia="Times New Roman" w:hAnsi="Times New Roman" w:cs="Times New Roman"/>
+          <w:kern w:val="0"/>
+          <w14:ligatures w14:val="none"/>
+        </w:rPr>
+        <w:br/>
+        <w:t xml:space="preserve">I removed the rows with missing values in </w:t>
+      </w:r>
+      <w:r>
+        <w:rPr>
+          <w:rFonts w:ascii="Courier New" w:eastAsia="Times New Roman" w:hAnsi="Courier New" w:cs="Courier New"/>
+          <w:kern w:val="0"/>
+          <w:sz w:val="20"/>
+          <w:szCs w:val="20"/>
+          <w14:ligatures w14:val="none"/>
+        </w:rPr>
+        <w:t>TotalCharges</w:t>
+      </w:r>
+      <w:r>
+        <w:rPr>
+          <w:rFonts w:ascii="Times New Roman" w:eastAsia="Times New Roman" w:hAnsi="Times New Roman" w:cs="Times New Roman"/>
+          <w:kern w:val="0"/>
+          <w14:ligatures w14:val="none"/>
+        </w:rPr>
+        <w:t xml:space="preserve"> because they mostly belong to new customers with </w:t>
+      </w:r>
+      <w:r>
+        <w:rPr>
+          <w:rFonts w:ascii="Courier New" w:eastAsia="Times New Roman" w:hAnsi="Courier New" w:cs="Courier New"/>
+          <w:kern w:val="0"/>
+          <w:sz w:val="20"/>
+          <w:szCs w:val="20"/>
+          <w14:ligatures w14:val="none"/>
+        </w:rPr>
+        <w:t>tenure = 0</w:t>
+      </w:r>
+      <w:r>
+        <w:rPr>
+          <w:rFonts w:ascii="Times New Roman" w:eastAsia="Times New Roman" w:hAnsi="Times New Roman" w:cs="Times New Roman"/>
+          <w:kern w:val="0"/>
+          <w14:ligatures w14:val="none"/>
+        </w:rPr>
+        <w:t>, and the number of affected rows is very small compared with the whole dataset.</w:t>
+      </w:r>
+    </w:p>
+    <w:p>
+      <w:pPr>
+        <w:spacing w:before="100" w:beforeAutospacing="1" w:after="100" w:afterAutospacing="1" w:line="240" w:lineRule="auto"/>
+        <w:rPr>
+          <w:rFonts w:ascii="Times New Roman" w:eastAsia="Times New Roman" w:hAnsi="Times New Roman" w:cs="Times New Roman"/>
+          <w:kern w:val="0"/>
+          <w14:ligatures w14:val="none"/>
+        </w:rPr>
+      </w:pPr>
+      <w:r>
+        <w:rPr>
+          <w:rFonts w:ascii="Heiti TC" w:eastAsia="Heiti TC" w:hAnsi="Heiti TC" w:cs="Heiti TC" w:hint="eastAsia"/>
+          <w:b/>
+          <w:bCs/>
+          <w:kern w:val="0"/>
+          <w14:ligatures w14:val="none"/>
+        </w:rPr>
+        <w:t>中文理解：</w:t>
+      </w:r>
+      <w:r>
+        <w:rPr>
+          <w:rFonts w:ascii="Times New Roman" w:eastAsia="Times New Roman" w:hAnsi="Times New Roman" w:cs="Times New Roman"/>
+          <w:kern w:val="0"/>
+          <w14:ligatures w14:val="none"/>
+        </w:rPr>
+        <w:br/>
+      </w:r>
+      <w:r>
+        <w:rPr>
+          <w:rFonts w:ascii="Heiti TC" w:eastAsia="Heiti TC" w:hAnsi="Heiti TC" w:cs="Heiti TC" w:hint="eastAsia"/>
+          <w:kern w:val="0"/>
+          <w14:ligatures w14:val="none"/>
+        </w:rPr>
+        <w:t>我刪除了</w:t>
+      </w:r>
+      <w:r>
+        <w:rPr>
+          <w:rFonts w:ascii="Times New Roman" w:eastAsia="Times New Roman" w:hAnsi="Times New Roman" w:cs="Times New Roman"/>
+          <w:kern w:val="0"/>
+          <w14:ligatures w14:val="none"/>
+        </w:rPr>
+        <w:t xml:space="preserve"> </w:t>
+      </w:r>
+      <w:r>
+        <w:rPr>
+          <w:rFonts w:ascii="Courier New" w:eastAsia="Times New Roman" w:hAnsi="Courier New" w:cs="Courier New"/>
+          <w:kern w:val="0"/>
+          <w:sz w:val="20"/>
+          <w:szCs w:val="20"/>
+          <w14:ligatures w14:val="none"/>
+        </w:rPr>
+        <w:t>TotalCharges</w:t>
+      </w:r>
+      <w:r>
+        <w:rPr>
+          <w:rFonts w:ascii="Times New Roman" w:eastAsia="Times New Roman" w:hAnsi="Times New Roman" w:cs="Times New Roman"/>
+          <w:kern w:val="0"/>
+          <w14:ligatures w14:val="none"/>
+        </w:rPr>
+        <w:t xml:space="preserve"> </w:t>
+      </w:r>
+      <w:r>
+        <w:rPr>
+          <w:rFonts w:ascii="Heiti TC" w:eastAsia="Heiti TC" w:hAnsi="Heiti TC" w:cs="Heiti TC" w:hint="eastAsia"/>
+          <w:kern w:val="0"/>
+          <w14:ligatures w14:val="none"/>
+        </w:rPr>
+        <w:t>缺失的列，因為這些通常是</w:t>
+      </w:r>
+      <w:r>
+        <w:rPr>
+          <w:rFonts w:ascii="Times New Roman" w:eastAsia="Times New Roman" w:hAnsi="Times New Roman" w:cs="Times New Roman"/>
+          <w:kern w:val="0"/>
+          <w14:ligatures w14:val="none"/>
+        </w:rPr>
+        <w:t xml:space="preserve"> </w:t>
+      </w:r>
+      <w:r>
+        <w:rPr>
+          <w:rFonts w:ascii="Courier New" w:eastAsia="Times New Roman" w:hAnsi="Courier New" w:cs="Courier New"/>
+          <w:kern w:val="0"/>
+          <w:sz w:val="20"/>
+          <w:szCs w:val="20"/>
+          <w14:ligatures w14:val="none"/>
+        </w:rPr>
+        <w:t>tenure = 0</w:t>
+      </w:r>
+      <w:r>
+        <w:rPr>
+          <w:rFonts w:ascii="Times New Roman" w:eastAsia="Times New Roman" w:hAnsi="Times New Roman" w:cs="Times New Roman"/>
+          <w:kern w:val="0"/>
+          <w14:ligatures w14:val="none"/>
+        </w:rPr>
+        <w:t xml:space="preserve"> </w:t>
+      </w:r>
+      <w:r>
+        <w:rPr>
+          <w:rFonts w:ascii="Heiti TC" w:eastAsia="Heiti TC" w:hAnsi="Heiti TC" w:cs="Heiti TC" w:hint="eastAsia"/>
+          <w:kern w:val="0"/>
+          <w14:ligatures w14:val="none"/>
+        </w:rPr>
+        <w:t>的新客戶，而且數量很少，對整體資料影響不大</w:t>
+      </w:r>
+      <w:r>
+        <w:rPr>
+          <w:rFonts w:ascii="Heiti TC" w:eastAsia="Heiti TC" w:hAnsi="Heiti TC" w:cs="Heiti TC"/>
+          <w:kern w:val="0"/>
+          <w14:ligatures w14:val="none"/>
+        </w:rPr>
+        <w:t>。</w:t>
+      </w:r>
+    </w:p>
+    <w:p>
+      <w:pPr>
+        <w:spacing w:after="0" w:line="240" w:lineRule="auto"/>
+        <w:rPr>
+          <w:rFonts w:ascii="Times New Roman" w:eastAsia="Times New Roman" w:hAnsi="Times New Roman" w:cs="Times New Roman"/>
+          <w:kern w:val="0"/>
+          <w14:ligatures w14:val="none"/>
+        </w:rPr>
+      </w:pPr>
+      <w:r>
+        <w:rPr>
+          <w:rFonts w:ascii="Times New Roman" w:eastAsia="Times New Roman" w:hAnsi="Times New Roman" w:cs="Times New Roman"/>
+          <w:noProof/>
+          <w:kern w:val="0"/>
+        </w:rPr>
+        <w:pict w14:anchorId="0FF960A9">
+          <v:rect id="_x0000_i1025" alt="" style="width:451.3pt;height:.05pt;mso-width-percent:0;mso-height-percent:0;mso-width-percent:0;mso-height-percent:0" o:hralign="center" o:hrstd="t" o:hr="t" fillcolor="#a0a0a0" stroked="f"/>
+        </w:pict>
+      </w:r>
+    </w:p>
+    <w:p>
+      <w:pPr>
+        <w:rPr>
+          <w:lang w:val="en-US"/>
+        </w:rPr>
+      </w:pPr>
     </w:p>
     <w:sectPr>
       <w:pgSz w:w="11906" w:h="16838"/>
@@ -1985,6 +3347,155 @@
     </w:lvl>
   </w:abstractNum>
   <w:abstractNum w:abstractNumId="3" w15:restartNumberingAfterBreak="0">
+    <w:nsid w:val="6B781FF4"/>
+    <w:multiLevelType w:val="multilevel"/>
+    <w:tmpl w:val="2DEADD30"/>
+    <w:lvl w:ilvl="0">
+      <w:start w:val="1"/>
+      <w:numFmt w:val="bullet"/>
+      <w:lvlText w:val=""/>
+      <w:lvlJc w:val="left"/>
+      <w:pPr>
+        <w:tabs>
+          <w:tab w:val="num" w:pos="720"/>
+        </w:tabs>
+        <w:ind w:left="720" w:hanging="360"/>
+      </w:pPr>
+      <w:rPr>
+        <w:rFonts w:ascii="Symbol" w:hAnsi="Symbol" w:hint="default"/>
+        <w:sz w:val="20"/>
+      </w:rPr>
+    </w:lvl>
+    <w:lvl w:ilvl="1" w:tentative="1">
+      <w:start w:val="1"/>
+      <w:numFmt w:val="bullet"/>
+      <w:lvlText w:val="o"/>
+      <w:lvlJc w:val="left"/>
+      <w:pPr>
+        <w:tabs>
+          <w:tab w:val="num" w:pos="1440"/>
+        </w:tabs>
+        <w:ind w:left="1440" w:hanging="360"/>
+      </w:pPr>
+      <w:rPr>
+        <w:rFonts w:ascii="Courier New" w:hAnsi="Courier New" w:hint="default"/>
+        <w:sz w:val="20"/>
+      </w:rPr>
+    </w:lvl>
+    <w:lvl w:ilvl="2" w:tentative="1">
+      <w:start w:val="1"/>
+      <w:numFmt w:val="bullet"/>
+      <w:lvlText w:val=""/>
+      <w:lvlJc w:val="left"/>
+      <w:pPr>
+        <w:tabs>
+          <w:tab w:val="num" w:pos="2160"/>
+        </w:tabs>
+        <w:ind w:left="2160" w:hanging="360"/>
+      </w:pPr>
+      <w:rPr>
+        <w:rFonts w:ascii="Wingdings" w:hAnsi="Wingdings" w:hint="default"/>
+        <w:sz w:val="20"/>
+      </w:rPr>
+    </w:lvl>
+    <w:lvl w:ilvl="3" w:tentative="1">
+      <w:start w:val="1"/>
+      <w:numFmt w:val="bullet"/>
+      <w:lvlText w:val=""/>
+      <w:lvlJc w:val="left"/>
+      <w:pPr>
+        <w:tabs>
+          <w:tab w:val="num" w:pos="2880"/>
+        </w:tabs>
+        <w:ind w:left="2880" w:hanging="360"/>
+      </w:pPr>
+      <w:rPr>
+        <w:rFonts w:ascii="Wingdings" w:hAnsi="Wingdings" w:hint="default"/>
+        <w:sz w:val="20"/>
+      </w:rPr>
+    </w:lvl>
+    <w:lvl w:ilvl="4" w:tentative="1">
+      <w:start w:val="1"/>
+      <w:numFmt w:val="bullet"/>
+      <w:lvlText w:val=""/>
+      <w:lvlJc w:val="left"/>
+      <w:pPr>
+        <w:tabs>
+          <w:tab w:val="num" w:pos="3600"/>
+        </w:tabs>
+        <w:ind w:left="3600" w:hanging="360"/>
+      </w:pPr>
+      <w:rPr>
+        <w:rFonts w:ascii="Wingdings" w:hAnsi="Wingdings" w:hint="default"/>
+        <w:sz w:val="20"/>
+      </w:rPr>
+    </w:lvl>
+    <w:lvl w:ilvl="5" w:tentative="1">
+      <w:start w:val="1"/>
+      <w:numFmt w:val="bullet"/>
+      <w:lvlText w:val=""/>
+      <w:lvlJc w:val="left"/>
+      <w:pPr>
+        <w:tabs>
+          <w:tab w:val="num" w:pos="4320"/>
+        </w:tabs>
+        <w:ind w:left="4320" w:hanging="360"/>
+      </w:pPr>
+      <w:rPr>
+        <w:rFonts w:ascii="Wingdings" w:hAnsi="Wingdings" w:hint="default"/>
+        <w:sz w:val="20"/>
+      </w:rPr>
+    </w:lvl>
+    <w:lvl w:ilvl="6" w:tentative="1">
+      <w:start w:val="1"/>
+      <w:numFmt w:val="bullet"/>
+      <w:lvlText w:val=""/>
+      <w:lvlJc w:val="left"/>
+      <w:pPr>
+        <w:tabs>
+          <w:tab w:val="num" w:pos="5040"/>
+        </w:tabs>
+        <w:ind w:left="5040" w:hanging="360"/>
+      </w:pPr>
+      <w:rPr>
+        <w:rFonts w:ascii="Wingdings" w:hAnsi="Wingdings" w:hint="default"/>
+        <w:sz w:val="20"/>
+      </w:rPr>
+    </w:lvl>
+    <w:lvl w:ilvl="7" w:tentative="1">
+      <w:start w:val="1"/>
+      <w:numFmt w:val="bullet"/>
+      <w:lvlText w:val=""/>
+      <w:lvlJc w:val="left"/>
+      <w:pPr>
+        <w:tabs>
+          <w:tab w:val="num" w:pos="5760"/>
+        </w:tabs>
+        <w:ind w:left="5760" w:hanging="360"/>
+      </w:pPr>
+      <w:rPr>
+        <w:rFonts w:ascii="Wingdings" w:hAnsi="Wingdings" w:hint="default"/>
+        <w:sz w:val="20"/>
+      </w:rPr>
+    </w:lvl>
+    <w:lvl w:ilvl="8" w:tentative="1">
+      <w:start w:val="1"/>
+      <w:numFmt w:val="bullet"/>
+      <w:lvlText w:val=""/>
+      <w:lvlJc w:val="left"/>
+      <w:pPr>
+        <w:tabs>
+          <w:tab w:val="num" w:pos="6480"/>
+        </w:tabs>
+        <w:ind w:left="6480" w:hanging="360"/>
+      </w:pPr>
+      <w:rPr>
+        <w:rFonts w:ascii="Wingdings" w:hAnsi="Wingdings" w:hint="default"/>
+        <w:sz w:val="20"/>
+      </w:rPr>
+    </w:lvl>
+  </w:abstractNum>
+  <w:abstractNum w:abstractNumId="4" w15:restartNumberingAfterBreak="0">
     <w:nsid w:val="749C487A"/>
     <w:multiLevelType w:val="multilevel"/>
     <w:tmpl w:val="5B8C96B6"/>
@@ -2133,7 +3644,7 @@
       </w:rPr>
     </w:lvl>
   </w:abstractNum>
-  <w:abstractNum w:abstractNumId="4" w15:restartNumberingAfterBreak="0">
+  <w:abstractNum w:abstractNumId="5" w15:restartNumberingAfterBreak="0">
     <w:nsid w:val="7A6D7498"/>
     <w:multiLevelType w:val="multilevel"/>
     <w:tmpl w:val="90300A0C"/>
@@ -2286,7 +3797,7 @@
     <w:abstractNumId w:val="2"/>
   </w:num>
   <w:num w:numId="2" w16cid:durableId="801312132">
-    <w:abstractNumId w:val="3"/>
+    <w:abstractNumId w:val="4"/>
   </w:num>
   <w:num w:numId="3" w16cid:durableId="841971690">
     <w:abstractNumId w:val="1"/>
@@ -2295,7 +3806,10 @@
     <w:abstractNumId w:val="0"/>
   </w:num>
   <w:num w:numId="5" w16cid:durableId="1707756244">
-    <w:abstractNumId w:val="4"/>
+    <w:abstractNumId w:val="5"/>
+  </w:num>
+  <w:num w:numId="6" w16cid:durableId="253129860">
+    <w:abstractNumId w:val="3"/>
   </w:num>
 </w:numbering>
 </file>
@@ -2750,7 +4264,6 @@
     <w:next w:val="Normal"/>
     <w:link w:val="Heading3Char"/>
     <w:uiPriority w:val="9"/>
-    <w:semiHidden/>
     <w:unhideWhenUsed/>
     <w:qFormat/>
     <w:rsid w:val="00B468E1"/>
@@ -2957,7 +4470,6 @@
     <w:basedOn w:val="DefaultParagraphFont"/>
     <w:link w:val="Heading3"/>
     <w:uiPriority w:val="9"/>
-    <w:semiHidden/>
     <w:rsid w:val="00B468E1"/>
     <w:rPr>
       <w:rFonts w:eastAsiaTheme="majorEastAsia" w:cstheme="majorBidi"/>
@@ -3226,6 +4738,33 @@
       <w:rFonts w:ascii="Courier New" w:eastAsia="Times New Roman" w:hAnsi="Courier New" w:cs="Courier New"/>
       <w:sz w:val="20"/>
       <w:szCs w:val="20"/>
+    </w:rPr>
+  </w:style>
+  <w:style w:type="paragraph" w:styleId="NormalWeb">
+    <w:name w:val="Normal (Web)"/>
+    <w:basedOn w:val="Normal"/>
+    <w:uiPriority w:val="99"/>
+    <w:semiHidden/>
+    <w:unhideWhenUsed/>
+    <w:rsid w:val="00AD1457"/>
+    <w:pPr>
+      <w:spacing w:before="100" w:beforeAutospacing="1" w:after="100" w:afterAutospacing="1" w:line="240" w:lineRule="auto"/>
+    </w:pPr>
+    <w:rPr>
+      <w:rFonts w:ascii="Times New Roman" w:eastAsia="Times New Roman" w:hAnsi="Times New Roman" w:cs="Times New Roman"/>
+      <w:kern w:val="0"/>
+      <w14:ligatures w14:val="none"/>
+    </w:rPr>
+  </w:style>
+  <w:style w:type="character" w:styleId="Strong">
+    <w:name w:val="Strong"/>
+    <w:basedOn w:val="DefaultParagraphFont"/>
+    <w:uiPriority w:val="22"/>
+    <w:qFormat/>
+    <w:rsid w:val="00AD1457"/>
+    <w:rPr>
+      <w:b/>
+      <w:bCs/>
     </w:rPr>
   </w:style>
 </w:styles>

</xml_diff>

<commit_message>
Complete Week 1 project setup, cleaning, and EDA
</commit_message>
<xml_diff>
--- a/Note.docx
+++ b/Note.docx
@@ -430,8 +430,10 @@
         </w:numPr>
         <w:spacing w:before="100" w:beforeAutospacing="1" w:after="100" w:afterAutospacing="1" w:line="240" w:lineRule="auto"/>
         <w:rPr>
-          <w:rFonts w:ascii="Times New Roman" w:eastAsia="Times New Roman" w:hAnsi="Times New Roman" w:cs="Times New Roman"/>
-          <w:kern w:val="0"/>
+          <w:rFonts w:ascii="Courier New" w:eastAsia="Times New Roman" w:hAnsi="Courier New" w:cs="Courier New"/>
+          <w:kern w:val="0"/>
+          <w:sz w:val="20"/>
+          <w:szCs w:val="20"/>
           <w14:ligatures w14:val="none"/>
         </w:rPr>
       </w:pPr>
@@ -447,19 +449,101 @@
       </w:r>
       <w:r>
         <w:rPr>
-          <w:rFonts w:ascii="Times New Roman" w:eastAsia="Times New Roman" w:hAnsi="Times New Roman" w:cs="Times New Roman"/>
-          <w:kern w:val="0"/>
-          <w14:ligatures w14:val="none"/>
-        </w:rPr>
-        <w:t xml:space="preserve"> </w:t>
-      </w:r>
-      <w:r>
-        <w:rPr>
-          <w:rFonts w:ascii="Times New Roman" w:eastAsia="Times New Roman" w:hAnsi="Times New Roman" w:cs="Times New Roman"/>
-          <w:kern w:val="0"/>
-          <w14:ligatures w14:val="none"/>
-        </w:rPr>
-        <w:t>:</w:t>
+          <w:rFonts w:ascii="Courier New" w:eastAsia="Times New Roman" w:hAnsi="Courier New" w:cs="Courier New"/>
+          <w:kern w:val="0"/>
+          <w:sz w:val="20"/>
+          <w:szCs w:val="20"/>
+          <w14:ligatures w14:val="none"/>
+        </w:rPr>
+        <w:t xml:space="preserve"> :</w:t>
+      </w:r>
+      <w:r>
+        <w:rPr>
+          <w:rFonts w:ascii="Courier New" w:eastAsia="Times New Roman" w:hAnsi="Courier New" w:cs="Courier New"/>
+          <w:kern w:val="0"/>
+          <w:sz w:val="20"/>
+          <w:szCs w:val="20"/>
+          <w14:ligatures w14:val="none"/>
+        </w:rPr>
+        <w:t xml:space="preserve"> The type of the contract</w:t>
+      </w:r>
+    </w:p>
+    <w:p>
+      <w:pPr>
+        <w:numPr>
+          <w:ilvl w:val="1"/>
+          <w:numId w:val="2"/>
+        </w:numPr>
+        <w:spacing w:before="100" w:beforeAutospacing="1" w:after="100" w:afterAutospacing="1" w:line="240" w:lineRule="auto"/>
+        <w:rPr>
+          <w:rFonts w:ascii="Courier New" w:eastAsia="Times New Roman" w:hAnsi="Courier New" w:cs="Courier New"/>
+          <w:kern w:val="0"/>
+          <w:sz w:val="20"/>
+          <w:szCs w:val="20"/>
+          <w14:ligatures w14:val="none"/>
+        </w:rPr>
+      </w:pPr>
+      <w:r>
+        <w:rPr>
+          <w:rFonts w:ascii="Courier New" w:eastAsia="Times New Roman" w:hAnsi="Courier New" w:cs="Courier New"/>
+          <w:kern w:val="0"/>
+          <w:sz w:val="20"/>
+          <w:szCs w:val="20"/>
+          <w14:ligatures w14:val="none"/>
+        </w:rPr>
+        <w:t>Month-to-month</w:t>
+      </w:r>
+    </w:p>
+    <w:p>
+      <w:pPr>
+        <w:numPr>
+          <w:ilvl w:val="1"/>
+          <w:numId w:val="2"/>
+        </w:numPr>
+        <w:spacing w:before="100" w:beforeAutospacing="1" w:after="100" w:afterAutospacing="1" w:line="240" w:lineRule="auto"/>
+        <w:rPr>
+          <w:rFonts w:ascii="Courier New" w:eastAsia="Times New Roman" w:hAnsi="Courier New" w:cs="Courier New"/>
+          <w:kern w:val="0"/>
+          <w:sz w:val="20"/>
+          <w:szCs w:val="20"/>
+          <w14:ligatures w14:val="none"/>
+        </w:rPr>
+      </w:pPr>
+      <w:r>
+        <w:rPr>
+          <w:rFonts w:ascii="Courier New" w:eastAsia="Times New Roman" w:hAnsi="Courier New" w:cs="Courier New"/>
+          <w:kern w:val="0"/>
+          <w:sz w:val="20"/>
+          <w:szCs w:val="20"/>
+          <w14:ligatures w14:val="none"/>
+        </w:rPr>
+        <w:t>One year</w:t>
+      </w:r>
+    </w:p>
+    <w:p>
+      <w:pPr>
+        <w:numPr>
+          <w:ilvl w:val="1"/>
+          <w:numId w:val="2"/>
+        </w:numPr>
+        <w:spacing w:before="100" w:beforeAutospacing="1" w:after="100" w:afterAutospacing="1" w:line="240" w:lineRule="auto"/>
+        <w:rPr>
+          <w:rFonts w:ascii="Courier New" w:eastAsia="Times New Roman" w:hAnsi="Courier New" w:cs="Courier New"/>
+          <w:kern w:val="0"/>
+          <w:sz w:val="20"/>
+          <w:szCs w:val="20"/>
+          <w14:ligatures w14:val="none"/>
+        </w:rPr>
+      </w:pPr>
+      <w:r>
+        <w:rPr>
+          <w:rFonts w:ascii="Courier New" w:eastAsia="Times New Roman" w:hAnsi="Courier New" w:cs="Courier New"/>
+          <w:kern w:val="0"/>
+          <w:sz w:val="20"/>
+          <w:szCs w:val="20"/>
+          <w14:ligatures w14:val="none"/>
+        </w:rPr>
+        <w:t>Two year</w:t>
       </w:r>
     </w:p>
     <w:p>
@@ -473,6 +557,7 @@
           <w:kern w:val="0"/>
           <w:sz w:val="36"/>
           <w:szCs w:val="36"/>
+          <w:lang w:val="en-US"/>
           <w14:ligatures w14:val="none"/>
         </w:rPr>
       </w:pPr>
@@ -490,15 +575,16 @@
       </w:r>
       <w:r>
         <w:rPr>
-          <w:rFonts w:ascii="Heiti TC" w:eastAsia="Heiti TC" w:hAnsi="Heiti TC" w:cs="Heiti TC" w:hint="eastAsia"/>
+          <w:rFonts w:ascii="Heiti TC" w:eastAsia="Heiti TC" w:hAnsi="Heiti TC" w:cs="Heiti TC"/>
           <w:b/>
           <w:bCs/>
           <w:kern w:val="0"/>
           <w:sz w:val="36"/>
           <w:szCs w:val="36"/>
-          <w14:ligatures w14:val="none"/>
-        </w:rPr>
-        <w:t>客戶使用哪些服務</w:t>
+          <w:lang w:val="en-US"/>
+          <w14:ligatures w14:val="none"/>
+        </w:rPr>
+        <w:t>Which server the client use</w:t>
       </w:r>
     </w:p>
     <w:p>
@@ -860,7 +946,27 @@
           <w:szCs w:val="20"/>
           <w14:ligatures w14:val="none"/>
         </w:rPr>
-        <w:t xml:space="preserve">OnlineBackup </w:t>
+        <w:t>OnlineBackup</w:t>
+      </w:r>
+      <w:r>
+        <w:rPr>
+          <w:rFonts w:ascii="Courier New" w:eastAsia="Times New Roman" w:hAnsi="Courier New" w:cs="Courier New"/>
+          <w:kern w:val="0"/>
+          <w:sz w:val="20"/>
+          <w:szCs w:val="20"/>
+          <w14:ligatures w14:val="none"/>
+        </w:rPr>
+        <w:t xml:space="preserve">: </w:t>
+      </w:r>
+      <w:r>
+        <w:rPr>
+          <w:rFonts w:ascii="Courier New" w:eastAsia="Times New Roman" w:hAnsi="Courier New" w:cs="Courier New"/>
+          <w:kern w:val="0"/>
+          <w:sz w:val="20"/>
+          <w:szCs w:val="20"/>
+          <w14:ligatures w14:val="none"/>
+        </w:rPr>
+        <w:t>Whether customer has online security</w:t>
       </w:r>
     </w:p>
     <w:p>
@@ -886,7 +992,27 @@
           <w:szCs w:val="20"/>
           <w14:ligatures w14:val="none"/>
         </w:rPr>
-        <w:t xml:space="preserve">DeviceProtection </w:t>
+        <w:t>DeviceProtection</w:t>
+      </w:r>
+      <w:r>
+        <w:rPr>
+          <w:rFonts w:ascii="Courier New" w:eastAsia="Times New Roman" w:hAnsi="Courier New" w:cs="Courier New"/>
+          <w:kern w:val="0"/>
+          <w:sz w:val="20"/>
+          <w:szCs w:val="20"/>
+          <w14:ligatures w14:val="none"/>
+        </w:rPr>
+        <w:t xml:space="preserve">: </w:t>
+      </w:r>
+      <w:r>
+        <w:rPr>
+          <w:rFonts w:ascii="Courier New" w:eastAsia="Times New Roman" w:hAnsi="Courier New" w:cs="Courier New"/>
+          <w:kern w:val="0"/>
+          <w:sz w:val="20"/>
+          <w:szCs w:val="20"/>
+          <w14:ligatures w14:val="none"/>
+        </w:rPr>
+        <w:t>Whether customer has device protection</w:t>
       </w:r>
     </w:p>
     <w:p>
@@ -912,7 +1038,27 @@
           <w:szCs w:val="20"/>
           <w14:ligatures w14:val="none"/>
         </w:rPr>
-        <w:t xml:space="preserve">TechSupport </w:t>
+        <w:t>TechSupport</w:t>
+      </w:r>
+      <w:r>
+        <w:rPr>
+          <w:rFonts w:ascii="Courier New" w:eastAsia="Times New Roman" w:hAnsi="Courier New" w:cs="Courier New"/>
+          <w:kern w:val="0"/>
+          <w:sz w:val="20"/>
+          <w:szCs w:val="20"/>
+          <w14:ligatures w14:val="none"/>
+        </w:rPr>
+        <w:t xml:space="preserve">: </w:t>
+      </w:r>
+      <w:r>
+        <w:rPr>
+          <w:rFonts w:ascii="Courier New" w:eastAsia="Times New Roman" w:hAnsi="Courier New" w:cs="Courier New"/>
+          <w:kern w:val="0"/>
+          <w:sz w:val="20"/>
+          <w:szCs w:val="20"/>
+          <w14:ligatures w14:val="none"/>
+        </w:rPr>
+        <w:t>Whether customer has technical support</w:t>
       </w:r>
     </w:p>
     <w:p>
@@ -938,7 +1084,27 @@
           <w:szCs w:val="20"/>
           <w14:ligatures w14:val="none"/>
         </w:rPr>
-        <w:t xml:space="preserve">StreamingTV </w:t>
+        <w:t>StreamingTV</w:t>
+      </w:r>
+      <w:r>
+        <w:rPr>
+          <w:rFonts w:ascii="Courier New" w:eastAsia="Times New Roman" w:hAnsi="Courier New" w:cs="Courier New"/>
+          <w:kern w:val="0"/>
+          <w:sz w:val="20"/>
+          <w:szCs w:val="20"/>
+          <w14:ligatures w14:val="none"/>
+        </w:rPr>
+        <w:t xml:space="preserve">: </w:t>
+      </w:r>
+      <w:r>
+        <w:rPr>
+          <w:rFonts w:ascii="Courier New" w:eastAsia="Times New Roman" w:hAnsi="Courier New" w:cs="Courier New"/>
+          <w:kern w:val="0"/>
+          <w:sz w:val="20"/>
+          <w:szCs w:val="20"/>
+          <w14:ligatures w14:val="none"/>
+        </w:rPr>
+        <w:t>Whether customer has streaming TV</w:t>
       </w:r>
     </w:p>
     <w:p>
@@ -966,6 +1132,16 @@
         </w:rPr>
         <w:t xml:space="preserve">StreamingMovies </w:t>
       </w:r>
+      <w:r>
+        <w:rPr>
+          <w:rFonts w:ascii="Courier New" w:eastAsia="Times New Roman" w:hAnsi="Courier New" w:cs="Courier New"/>
+          <w:kern w:val="0"/>
+          <w:sz w:val="20"/>
+          <w:szCs w:val="20"/>
+          <w14:ligatures w14:val="none"/>
+        </w:rPr>
+        <w:t>Whether customer has streaming movies</w:t>
+      </w:r>
     </w:p>
     <w:p>
       <w:pPr>
@@ -978,6 +1154,7 @@
           <w:kern w:val="0"/>
           <w:sz w:val="36"/>
           <w:szCs w:val="36"/>
+          <w:lang w:val="en-US"/>
           <w14:ligatures w14:val="none"/>
         </w:rPr>
       </w:pPr>
@@ -995,15 +1172,16 @@
       </w:r>
       <w:r>
         <w:rPr>
-          <w:rFonts w:ascii="Heiti TC" w:eastAsia="Heiti TC" w:hAnsi="Heiti TC" w:cs="Heiti TC" w:hint="eastAsia"/>
+          <w:rFonts w:ascii="Heiti TC" w:eastAsia="Heiti TC" w:hAnsi="Heiti TC" w:cs="Heiti TC"/>
           <w:b/>
           <w:bCs/>
           <w:kern w:val="0"/>
           <w:sz w:val="36"/>
           <w:szCs w:val="36"/>
-          <w14:ligatures w14:val="none"/>
-        </w:rPr>
-        <w:t>帳單與付款</w:t>
+          <w:lang w:val="en-US"/>
+          <w14:ligatures w14:val="none"/>
+        </w:rPr>
+        <w:t>Bill &amp; payment</w:t>
       </w:r>
     </w:p>
     <w:p>
@@ -1145,6 +1323,7 @@
           <w:kern w:val="0"/>
           <w:sz w:val="36"/>
           <w:szCs w:val="36"/>
+          <w:lang w:val="en-US"/>
           <w14:ligatures w14:val="none"/>
         </w:rPr>
       </w:pPr>
@@ -1162,15 +1341,16 @@
       </w:r>
       <w:r>
         <w:rPr>
-          <w:rFonts w:ascii="Heiti TC" w:eastAsia="Heiti TC" w:hAnsi="Heiti TC" w:cs="Heiti TC" w:hint="eastAsia"/>
+          <w:rFonts w:ascii="Heiti TC" w:eastAsia="Heiti TC" w:hAnsi="Heiti TC" w:cs="Heiti TC"/>
           <w:b/>
           <w:bCs/>
           <w:kern w:val="0"/>
           <w:sz w:val="36"/>
           <w:szCs w:val="36"/>
-          <w14:ligatures w14:val="none"/>
-        </w:rPr>
-        <w:t>預測目標</w:t>
+          <w:lang w:val="en-US"/>
+          <w14:ligatures w14:val="none"/>
+        </w:rPr>
+        <w:t>Predict Target:</w:t>
       </w:r>
     </w:p>
     <w:p>
@@ -1181,8 +1361,10 @@
         </w:numPr>
         <w:spacing w:before="100" w:beforeAutospacing="1" w:after="100" w:afterAutospacing="1" w:line="240" w:lineRule="auto"/>
         <w:rPr>
-          <w:rFonts w:ascii="Times New Roman" w:eastAsia="Times New Roman" w:hAnsi="Times New Roman" w:cs="Times New Roman"/>
-          <w:kern w:val="0"/>
+          <w:rFonts w:ascii="Courier New" w:eastAsia="Times New Roman" w:hAnsi="Courier New" w:cs="Courier New"/>
+          <w:kern w:val="0"/>
+          <w:sz w:val="20"/>
+          <w:szCs w:val="20"/>
           <w14:ligatures w14:val="none"/>
         </w:rPr>
       </w:pPr>
@@ -1195,6 +1377,29 @@
           <w14:ligatures w14:val="none"/>
         </w:rPr>
         <w:t>Churn</w:t>
+      </w:r>
+      <w:r>
+        <w:rPr>
+          <w:rFonts w:ascii="Courier New" w:eastAsia="Times New Roman" w:hAnsi="Courier New" w:cs="Courier New"/>
+          <w:kern w:val="0"/>
+          <w:sz w:val="20"/>
+          <w:szCs w:val="20"/>
+          <w14:ligatures w14:val="none"/>
+        </w:rPr>
+        <w:t>:</w:t>
+      </w:r>
+      <w:r>
+        <w:t xml:space="preserve"> </w:t>
+      </w:r>
+      <w:r>
+        <w:rPr>
+          <w:rFonts w:ascii="Courier New" w:eastAsia="Times New Roman" w:hAnsi="Courier New" w:cs="Courier New"/>
+          <w:kern w:val="0"/>
+          <w:sz w:val="20"/>
+          <w:szCs w:val="20"/>
+          <w14:ligatures w14:val="none"/>
+        </w:rPr>
+        <w:t>Whether customer left the company</w:t>
       </w:r>
     </w:p>
     <w:p>
@@ -1734,7 +1939,7 @@
           <w:noProof/>
           <w:kern w:val="0"/>
         </w:rPr>
-        <w:pict w14:anchorId="3A8A6C36">
+        <w:pict w14:anchorId="0CC05A4C">
           <v:rect id="_x0000_i1027" alt="" style="width:451.3pt;height:.05pt;mso-width-percent:0;mso-height-percent:0;mso-width-percent:0;mso-height-percent:0" o:hralign="center" o:hrstd="t" o:hr="t" fillcolor="#a0a0a0" stroked="f"/>
         </w:pict>
       </w:r>
@@ -2501,7 +2706,7 @@
           <w:noProof/>
           <w:kern w:val="0"/>
         </w:rPr>
-        <w:pict w14:anchorId="459C04A6">
+        <w:pict w14:anchorId="046FE2BB">
           <v:rect id="_x0000_i1026" alt="" style="width:451.3pt;height:.05pt;mso-width-percent:0;mso-height-percent:0;mso-width-percent:0;mso-height-percent:0" o:hralign="center" o:hrstd="t" o:hr="t" fillcolor="#a0a0a0" stroked="f"/>
         </w:pict>
       </w:r>
@@ -2875,7 +3080,7 @@
           <w:noProof/>
           <w:kern w:val="0"/>
         </w:rPr>
-        <w:pict w14:anchorId="0FF960A9">
+        <w:pict w14:anchorId="4C5ACDB6">
           <v:rect id="_x0000_i1025" alt="" style="width:451.3pt;height:.05pt;mso-width-percent:0;mso-height-percent:0;mso-width-percent:0;mso-height-percent:0" o:hralign="center" o:hrstd="t" o:hr="t" fillcolor="#a0a0a0" stroked="f"/>
         </w:pict>
       </w:r>

</xml_diff>